<commit_message>
Adding versioning and lineage tracking feature
</commit_message>
<xml_diff>
--- a/docs/Group-47.docx
+++ b/docs/Group-47.docx
@@ -8386,10 +8386,1439 @@
     </w:p>
     <w:p>
       <w:pPr>
-        <w:rPr>
-          <w:lang w:val="en-US"/>
-        </w:rPr>
-      </w:pPr>
+        <w:pStyle w:val="Heading1"/>
+        <w:numPr>
+          <w:ilvl w:val="0"/>
+          <w:numId w:val="7"/>
+        </w:numPr>
+        <w:rPr>
+          <w:lang w:val="en-US"/>
+        </w:rPr>
+      </w:pPr>
+      <w:r>
+        <w:rPr>
+          <w:lang w:val="en-US"/>
+        </w:rPr>
+        <w:lastRenderedPageBreak/>
+        <w:t>Feature Store</w:t>
+      </w:r>
+    </w:p>
+    <w:p>
+      <w:pPr>
+        <w:pStyle w:val="Heading2"/>
+        <w:numPr>
+          <w:ilvl w:val="1"/>
+          <w:numId w:val="7"/>
+        </w:numPr>
+        <w:ind w:left="0" w:firstLine="0"/>
+        <w:rPr>
+          <w:lang w:val="en-US"/>
+        </w:rPr>
+      </w:pPr>
+      <w:r>
+        <w:rPr>
+          <w:lang w:val="en-US"/>
+        </w:rPr>
+        <w:t>Overview</w:t>
+      </w:r>
+    </w:p>
+    <w:p>
+      <w:pPr>
+        <w:rPr>
+          <w:lang w:val="en-US"/>
+        </w:rPr>
+      </w:pPr>
+      <w:r>
+        <w:rPr>
+          <w:lang w:val="en-US"/>
+        </w:rPr>
+        <w:t>A lightweight feature store is implemented to manage, store, and retrieve engineered features for both training and inference workflows. The feature store is built using a combination of a SQLite database for storage and a custom metadata registry to track feature definitions, sources, and transformations.</w:t>
+      </w:r>
+    </w:p>
+    <w:p>
+      <w:pPr>
+        <w:rPr>
+          <w:lang w:val="en-US"/>
+        </w:rPr>
+      </w:pPr>
+      <w:r>
+        <w:rPr>
+          <w:lang w:val="en-US"/>
+        </w:rPr>
+        <w:t>This approach ensures simplicity, reproducibility, and alignment with the assignment scope while reflecting key principles of production-grade feature stores.</w:t>
+      </w:r>
+    </w:p>
+    <w:p>
+      <w:pPr>
+        <w:pStyle w:val="Heading2"/>
+        <w:numPr>
+          <w:ilvl w:val="1"/>
+          <w:numId w:val="7"/>
+        </w:numPr>
+        <w:ind w:left="0" w:firstLine="0"/>
+        <w:rPr>
+          <w:lang w:val="en-US"/>
+        </w:rPr>
+      </w:pPr>
+      <w:r>
+        <w:rPr>
+          <w:lang w:val="en-US"/>
+        </w:rPr>
+        <w:t>Architecture</w:t>
+      </w:r>
+    </w:p>
+    <w:p>
+      <w:pPr>
+        <w:rPr>
+          <w:lang w:val="en-US"/>
+        </w:rPr>
+      </w:pPr>
+      <w:r>
+        <w:rPr>
+          <w:lang w:val="en-US"/>
+        </w:rPr>
+        <w:t>The feature store sits downstream of the feature engineering pipeline and provides a unified interface for accessing features.</w:t>
+      </w:r>
+    </w:p>
+    <w:p>
+      <w:pPr>
+        <w:pStyle w:val="Heading2"/>
+        <w:numPr>
+          <w:ilvl w:val="1"/>
+          <w:numId w:val="7"/>
+        </w:numPr>
+        <w:ind w:left="0" w:firstLine="0"/>
+        <w:rPr>
+          <w:lang w:val="en-US"/>
+        </w:rPr>
+      </w:pPr>
+      <w:r>
+        <w:rPr>
+          <w:lang w:val="en-US"/>
+        </w:rPr>
+        <w:t>Feature Storage</w:t>
+      </w:r>
+    </w:p>
+    <w:p>
+      <w:pPr>
+        <w:rPr>
+          <w:lang w:val="en-US"/>
+        </w:rPr>
+      </w:pPr>
+      <w:r>
+        <w:rPr>
+          <w:lang w:val="en-US"/>
+        </w:rPr>
+        <w:t>The engineered features are stored in a structured SQLite database (</w:t>
+      </w:r>
+      <w:proofErr w:type="spellStart"/>
+      <w:r>
+        <w:rPr>
+          <w:lang w:val="en-US"/>
+        </w:rPr>
+        <w:t>features.db</w:t>
+      </w:r>
+      <w:proofErr w:type="spellEnd"/>
+      <w:r>
+        <w:rPr>
+          <w:lang w:val="en-US"/>
+        </w:rPr>
+        <w:t>) with the following tables:</w:t>
+      </w:r>
+    </w:p>
+    <w:p>
+      <w:pPr>
+        <w:pStyle w:val="ListParagraph"/>
+        <w:numPr>
+          <w:ilvl w:val="0"/>
+          <w:numId w:val="54"/>
+        </w:numPr>
+        <w:rPr>
+          <w:lang w:val="en-US"/>
+        </w:rPr>
+      </w:pPr>
+      <w:proofErr w:type="spellStart"/>
+      <w:r>
+        <w:rPr>
+          <w:lang w:val="en-US"/>
+        </w:rPr>
+        <w:t>user_features</w:t>
+      </w:r>
+      <w:proofErr w:type="spellEnd"/>
+    </w:p>
+    <w:p>
+      <w:pPr>
+        <w:pStyle w:val="ListParagraph"/>
+        <w:numPr>
+          <w:ilvl w:val="0"/>
+          <w:numId w:val="54"/>
+        </w:numPr>
+        <w:rPr>
+          <w:lang w:val="en-US"/>
+        </w:rPr>
+      </w:pPr>
+      <w:proofErr w:type="spellStart"/>
+      <w:r>
+        <w:rPr>
+          <w:lang w:val="en-US"/>
+        </w:rPr>
+        <w:t>item_features</w:t>
+      </w:r>
+      <w:proofErr w:type="spellEnd"/>
+    </w:p>
+    <w:p>
+      <w:pPr>
+        <w:pStyle w:val="ListParagraph"/>
+        <w:numPr>
+          <w:ilvl w:val="0"/>
+          <w:numId w:val="54"/>
+        </w:numPr>
+        <w:rPr>
+          <w:lang w:val="en-US"/>
+        </w:rPr>
+      </w:pPr>
+      <w:proofErr w:type="spellStart"/>
+      <w:r>
+        <w:rPr>
+          <w:lang w:val="en-US"/>
+        </w:rPr>
+        <w:t>interaction_features</w:t>
+      </w:r>
+      <w:proofErr w:type="spellEnd"/>
+    </w:p>
+    <w:p>
+      <w:pPr>
+        <w:rPr>
+          <w:lang w:val="en-US"/>
+        </w:rPr>
+      </w:pPr>
+      <w:r>
+        <w:rPr>
+          <w:lang w:val="en-US"/>
+        </w:rPr>
+        <w:t>Each table captures aggregated features derived from transactional and clickstream data.</w:t>
+      </w:r>
+    </w:p>
+    <w:p>
+      <w:pPr>
+        <w:rPr>
+          <w:lang w:val="en-US"/>
+        </w:rPr>
+      </w:pPr>
+    </w:p>
+    <w:p>
+      <w:pPr>
+        <w:pStyle w:val="Heading2"/>
+        <w:numPr>
+          <w:ilvl w:val="1"/>
+          <w:numId w:val="7"/>
+        </w:numPr>
+        <w:ind w:left="0" w:firstLine="0"/>
+        <w:rPr>
+          <w:lang w:val="en-US"/>
+        </w:rPr>
+      </w:pPr>
+      <w:r>
+        <w:rPr>
+          <w:lang w:val="en-US"/>
+        </w:rPr>
+        <w:t>Feature Metadata Registry</w:t>
+      </w:r>
+    </w:p>
+    <w:p>
+      <w:pPr>
+        <w:rPr>
+          <w:lang w:val="en-US"/>
+        </w:rPr>
+      </w:pPr>
+      <w:r>
+        <w:rPr>
+          <w:lang w:val="en-US"/>
+        </w:rPr>
+        <w:t>A metadata registry is maintained in a JSON file to document:</w:t>
+      </w:r>
+    </w:p>
+    <w:p>
+      <w:pPr>
+        <w:pStyle w:val="ListParagraph"/>
+        <w:numPr>
+          <w:ilvl w:val="0"/>
+          <w:numId w:val="55"/>
+        </w:numPr>
+        <w:rPr>
+          <w:lang w:val="en-US"/>
+        </w:rPr>
+      </w:pPr>
+      <w:r>
+        <w:rPr>
+          <w:lang w:val="en-US"/>
+        </w:rPr>
+        <w:t>Feature name</w:t>
+      </w:r>
+    </w:p>
+    <w:p>
+      <w:pPr>
+        <w:pStyle w:val="ListParagraph"/>
+        <w:numPr>
+          <w:ilvl w:val="0"/>
+          <w:numId w:val="55"/>
+        </w:numPr>
+        <w:rPr>
+          <w:lang w:val="en-US"/>
+        </w:rPr>
+      </w:pPr>
+      <w:r>
+        <w:rPr>
+          <w:lang w:val="en-US"/>
+        </w:rPr>
+        <w:t>Associated entity (user/item/interaction)</w:t>
+      </w:r>
+    </w:p>
+    <w:p>
+      <w:pPr>
+        <w:pStyle w:val="ListParagraph"/>
+        <w:numPr>
+          <w:ilvl w:val="0"/>
+          <w:numId w:val="55"/>
+        </w:numPr>
+        <w:rPr>
+          <w:lang w:val="en-US"/>
+        </w:rPr>
+      </w:pPr>
+      <w:r>
+        <w:rPr>
+          <w:lang w:val="en-US"/>
+        </w:rPr>
+        <w:t>Source data</w:t>
+      </w:r>
+    </w:p>
+    <w:p>
+      <w:pPr>
+        <w:pStyle w:val="ListParagraph"/>
+        <w:numPr>
+          <w:ilvl w:val="0"/>
+          <w:numId w:val="55"/>
+        </w:numPr>
+        <w:rPr>
+          <w:lang w:val="en-US"/>
+        </w:rPr>
+      </w:pPr>
+      <w:r>
+        <w:rPr>
+          <w:lang w:val="en-US"/>
+        </w:rPr>
+        <w:t>Transformation logic</w:t>
+      </w:r>
+    </w:p>
+    <w:p>
+      <w:pPr>
+        <w:rPr>
+          <w:lang w:val="en-US"/>
+        </w:rPr>
+      </w:pPr>
+      <w:r>
+        <w:rPr>
+          <w:lang w:val="en-US"/>
+        </w:rPr>
+        <w:t>This ensures traceability and interpretability of features.</w:t>
+      </w:r>
+    </w:p>
+    <w:p>
+      <w:pPr>
+        <w:pStyle w:val="Heading2"/>
+        <w:numPr>
+          <w:ilvl w:val="1"/>
+          <w:numId w:val="7"/>
+        </w:numPr>
+        <w:ind w:left="0" w:firstLine="0"/>
+        <w:rPr>
+          <w:lang w:val="en-US"/>
+        </w:rPr>
+      </w:pPr>
+      <w:r>
+        <w:rPr>
+          <w:lang w:val="en-US"/>
+        </w:rPr>
+        <w:t>Feature Versioning</w:t>
+      </w:r>
+    </w:p>
+    <w:p>
+      <w:pPr>
+        <w:rPr>
+          <w:lang w:val="en-US"/>
+        </w:rPr>
+      </w:pPr>
+      <w:r>
+        <w:rPr>
+          <w:lang w:val="en-US"/>
+        </w:rPr>
+        <w:t>Feature versioning is implemented using a version identifier (e.g., v1) stored in the metadata registry. This allows:</w:t>
+      </w:r>
+    </w:p>
+    <w:p>
+      <w:pPr>
+        <w:rPr>
+          <w:lang w:val="en-US"/>
+        </w:rPr>
+      </w:pPr>
+    </w:p>
+    <w:p>
+      <w:pPr>
+        <w:pStyle w:val="ListParagraph"/>
+        <w:numPr>
+          <w:ilvl w:val="0"/>
+          <w:numId w:val="56"/>
+        </w:numPr>
+        <w:rPr>
+          <w:lang w:val="en-US"/>
+        </w:rPr>
+      </w:pPr>
+      <w:r>
+        <w:rPr>
+          <w:lang w:val="en-US"/>
+        </w:rPr>
+        <w:lastRenderedPageBreak/>
+        <w:t>Reproducibility of experiments</w:t>
+      </w:r>
+    </w:p>
+    <w:p>
+      <w:pPr>
+        <w:pStyle w:val="ListParagraph"/>
+        <w:numPr>
+          <w:ilvl w:val="0"/>
+          <w:numId w:val="56"/>
+        </w:numPr>
+        <w:rPr>
+          <w:lang w:val="en-US"/>
+        </w:rPr>
+      </w:pPr>
+      <w:r>
+        <w:rPr>
+          <w:lang w:val="en-US"/>
+        </w:rPr>
+        <w:t>Tracking of feature evolution</w:t>
+      </w:r>
+    </w:p>
+    <w:p>
+      <w:pPr>
+        <w:pStyle w:val="ListParagraph"/>
+        <w:numPr>
+          <w:ilvl w:val="0"/>
+          <w:numId w:val="56"/>
+        </w:numPr>
+        <w:rPr>
+          <w:lang w:val="en-US"/>
+        </w:rPr>
+      </w:pPr>
+      <w:r>
+        <w:rPr>
+          <w:lang w:val="en-US"/>
+        </w:rPr>
+        <w:t>Consistent feature usage across training and inference</w:t>
+      </w:r>
+    </w:p>
+    <w:p>
+      <w:pPr>
+        <w:pStyle w:val="Heading2"/>
+        <w:numPr>
+          <w:ilvl w:val="1"/>
+          <w:numId w:val="7"/>
+        </w:numPr>
+        <w:ind w:left="0" w:firstLine="0"/>
+        <w:rPr>
+          <w:lang w:val="en-US"/>
+        </w:rPr>
+      </w:pPr>
+      <w:r>
+        <w:rPr>
+          <w:lang w:val="en-US"/>
+        </w:rPr>
+        <w:t>Feature Retrieval Interface</w:t>
+      </w:r>
+    </w:p>
+    <w:p>
+      <w:pPr>
+        <w:rPr>
+          <w:lang w:val="en-US"/>
+        </w:rPr>
+      </w:pPr>
+      <w:r>
+        <w:rPr>
+          <w:lang w:val="en-US"/>
+        </w:rPr>
+        <w:t>A custom Python-based API is implemented to retrieve features from the store. The interface supports:</w:t>
+      </w:r>
+    </w:p>
+    <w:p>
+      <w:pPr>
+        <w:pStyle w:val="ListParagraph"/>
+        <w:numPr>
+          <w:ilvl w:val="0"/>
+          <w:numId w:val="57"/>
+        </w:numPr>
+        <w:rPr>
+          <w:lang w:val="en-US"/>
+        </w:rPr>
+      </w:pPr>
+      <w:r>
+        <w:rPr>
+          <w:lang w:val="en-US"/>
+        </w:rPr>
+        <w:t>User-level feature retrieval</w:t>
+      </w:r>
+    </w:p>
+    <w:p>
+      <w:pPr>
+        <w:pStyle w:val="ListParagraph"/>
+        <w:numPr>
+          <w:ilvl w:val="0"/>
+          <w:numId w:val="57"/>
+        </w:numPr>
+        <w:rPr>
+          <w:lang w:val="en-US"/>
+        </w:rPr>
+      </w:pPr>
+      <w:r>
+        <w:rPr>
+          <w:lang w:val="en-US"/>
+        </w:rPr>
+        <w:t>Item-level feature retrieval</w:t>
+      </w:r>
+    </w:p>
+    <w:p>
+      <w:pPr>
+        <w:pStyle w:val="ListParagraph"/>
+        <w:numPr>
+          <w:ilvl w:val="0"/>
+          <w:numId w:val="57"/>
+        </w:numPr>
+        <w:rPr>
+          <w:lang w:val="en-US"/>
+        </w:rPr>
+      </w:pPr>
+      <w:r>
+        <w:rPr>
+          <w:lang w:val="en-US"/>
+        </w:rPr>
+        <w:t>Interaction-level feature retrieval</w:t>
+      </w:r>
+    </w:p>
+    <w:p>
+      <w:pPr>
+        <w:rPr>
+          <w:lang w:val="en-US"/>
+        </w:rPr>
+      </w:pPr>
+      <w:r>
+        <w:rPr>
+          <w:lang w:val="en-US"/>
+        </w:rPr>
+        <w:t>This abstraction ensures that downstream components can access features without directly querying the database.</w:t>
+      </w:r>
+    </w:p>
+    <w:p>
+      <w:pPr>
+        <w:pStyle w:val="Heading2"/>
+        <w:numPr>
+          <w:ilvl w:val="1"/>
+          <w:numId w:val="7"/>
+        </w:numPr>
+        <w:ind w:left="0" w:firstLine="0"/>
+        <w:rPr>
+          <w:lang w:val="en-US"/>
+        </w:rPr>
+      </w:pPr>
+      <w:r>
+        <w:rPr>
+          <w:lang w:val="en-US"/>
+        </w:rPr>
+        <w:t>Sample Feature Retrieval</w:t>
+      </w:r>
+    </w:p>
+    <w:p>
+      <w:pPr>
+        <w:rPr>
+          <w:lang w:val="en-US"/>
+        </w:rPr>
+      </w:pPr>
+      <w:r>
+        <w:rPr>
+          <w:lang w:val="en-US"/>
+        </w:rPr>
+        <w:t>The feature store provides programmatic access to features, enabling seamless integration with machine learning workflows.</w:t>
+      </w:r>
+    </w:p>
+    <w:p>
+      <w:pPr>
+        <w:rPr>
+          <w:lang w:val="en-US"/>
+        </w:rPr>
+      </w:pPr>
+      <w:r>
+        <w:rPr>
+          <w:lang w:val="en-US"/>
+        </w:rPr>
+        <w:t>Example:</w:t>
+      </w:r>
+    </w:p>
+    <w:p>
+      <w:pPr>
+        <w:pStyle w:val="ListParagraph"/>
+        <w:numPr>
+          <w:ilvl w:val="0"/>
+          <w:numId w:val="58"/>
+        </w:numPr>
+        <w:rPr>
+          <w:lang w:val="en-US"/>
+        </w:rPr>
+      </w:pPr>
+      <w:r>
+        <w:rPr>
+          <w:lang w:val="en-US"/>
+        </w:rPr>
+        <w:t xml:space="preserve">Retrieve user features using </w:t>
+      </w:r>
+      <w:proofErr w:type="spellStart"/>
+      <w:r>
+        <w:rPr>
+          <w:lang w:val="en-US"/>
+        </w:rPr>
+        <w:t>user_id</w:t>
+      </w:r>
+      <w:proofErr w:type="spellEnd"/>
+    </w:p>
+    <w:p>
+      <w:pPr>
+        <w:pStyle w:val="ListParagraph"/>
+        <w:numPr>
+          <w:ilvl w:val="0"/>
+          <w:numId w:val="58"/>
+        </w:numPr>
+        <w:rPr>
+          <w:lang w:val="en-US"/>
+        </w:rPr>
+      </w:pPr>
+      <w:r>
+        <w:rPr>
+          <w:lang w:val="en-US"/>
+        </w:rPr>
+        <w:t xml:space="preserve">Retrieve item features using </w:t>
+      </w:r>
+      <w:proofErr w:type="spellStart"/>
+      <w:r>
+        <w:rPr>
+          <w:lang w:val="en-US"/>
+        </w:rPr>
+        <w:t>product_id</w:t>
+      </w:r>
+      <w:proofErr w:type="spellEnd"/>
+    </w:p>
+    <w:p>
+      <w:pPr>
+        <w:pStyle w:val="ListParagraph"/>
+        <w:numPr>
+          <w:ilvl w:val="0"/>
+          <w:numId w:val="58"/>
+        </w:numPr>
+        <w:rPr>
+          <w:lang w:val="en-US"/>
+        </w:rPr>
+      </w:pPr>
+      <w:r>
+        <w:rPr>
+          <w:lang w:val="en-US"/>
+        </w:rPr>
+        <w:t>Retrieve interaction features using (</w:t>
+      </w:r>
+      <w:proofErr w:type="spellStart"/>
+      <w:r>
+        <w:rPr>
+          <w:lang w:val="en-US"/>
+        </w:rPr>
+        <w:t>user_id</w:t>
+      </w:r>
+      <w:proofErr w:type="spellEnd"/>
+      <w:r>
+        <w:rPr>
+          <w:lang w:val="en-US"/>
+        </w:rPr>
+        <w:t xml:space="preserve">, </w:t>
+      </w:r>
+      <w:proofErr w:type="spellStart"/>
+      <w:r>
+        <w:rPr>
+          <w:lang w:val="en-US"/>
+        </w:rPr>
+        <w:t>product_id</w:t>
+      </w:r>
+      <w:proofErr w:type="spellEnd"/>
+      <w:r>
+        <w:rPr>
+          <w:lang w:val="en-US"/>
+        </w:rPr>
+        <w:t>)</w:t>
+      </w:r>
+    </w:p>
+    <w:p>
+      <w:pPr>
+        <w:pStyle w:val="Heading2"/>
+        <w:numPr>
+          <w:ilvl w:val="1"/>
+          <w:numId w:val="7"/>
+        </w:numPr>
+        <w:ind w:left="0" w:firstLine="0"/>
+        <w:rPr>
+          <w:lang w:val="en-US"/>
+        </w:rPr>
+      </w:pPr>
+      <w:r>
+        <w:rPr>
+          <w:lang w:val="en-US"/>
+        </w:rPr>
+        <w:t>Design Justification</w:t>
+      </w:r>
+    </w:p>
+    <w:p>
+      <w:pPr>
+        <w:rPr>
+          <w:lang w:val="en-US"/>
+        </w:rPr>
+      </w:pPr>
+      <w:r>
+        <w:rPr>
+          <w:lang w:val="en-US"/>
+        </w:rPr>
+        <w:t>The implemented feature store design balances simplicity and functionality:</w:t>
+      </w:r>
+    </w:p>
+    <w:p>
+      <w:pPr>
+        <w:pStyle w:val="ListParagraph"/>
+        <w:numPr>
+          <w:ilvl w:val="0"/>
+          <w:numId w:val="59"/>
+        </w:numPr>
+        <w:rPr>
+          <w:lang w:val="en-US"/>
+        </w:rPr>
+      </w:pPr>
+      <w:r>
+        <w:rPr>
+          <w:lang w:val="en-US"/>
+        </w:rPr>
+        <w:t>SQLite provides a lightweight yet structured storage solution</w:t>
+      </w:r>
+    </w:p>
+    <w:p>
+      <w:pPr>
+        <w:pStyle w:val="ListParagraph"/>
+        <w:numPr>
+          <w:ilvl w:val="0"/>
+          <w:numId w:val="59"/>
+        </w:numPr>
+        <w:rPr>
+          <w:lang w:val="en-US"/>
+        </w:rPr>
+      </w:pPr>
+      <w:r>
+        <w:rPr>
+          <w:lang w:val="en-US"/>
+        </w:rPr>
+        <w:t>JSON-based metadata enables easy documentation and extensibility</w:t>
+      </w:r>
+    </w:p>
+    <w:p>
+      <w:pPr>
+        <w:pStyle w:val="ListParagraph"/>
+        <w:numPr>
+          <w:ilvl w:val="0"/>
+          <w:numId w:val="59"/>
+        </w:numPr>
+        <w:rPr>
+          <w:lang w:val="en-US"/>
+        </w:rPr>
+      </w:pPr>
+      <w:r>
+        <w:rPr>
+          <w:lang w:val="en-US"/>
+        </w:rPr>
+        <w:t>Python-based retrieval APIs ensure modularity and usability</w:t>
+      </w:r>
+    </w:p>
+    <w:p>
+      <w:pPr>
+        <w:rPr>
+          <w:lang w:val="en-US"/>
+        </w:rPr>
+      </w:pPr>
+      <w:r>
+        <w:rPr>
+          <w:lang w:val="en-US"/>
+        </w:rPr>
+        <w:t>While production systems may use tools like Feast, the current implementation captures the essential components of a feature store within the constraints of the assignment.</w:t>
+      </w:r>
+    </w:p>
+    <w:p>
+      <w:pPr>
+        <w:pStyle w:val="Heading2"/>
+        <w:numPr>
+          <w:ilvl w:val="1"/>
+          <w:numId w:val="7"/>
+        </w:numPr>
+        <w:ind w:left="0" w:firstLine="0"/>
+        <w:rPr>
+          <w:lang w:val="en-US"/>
+        </w:rPr>
+      </w:pPr>
+      <w:r>
+        <w:rPr>
+          <w:lang w:val="en-US"/>
+        </w:rPr>
+        <w:t>Summary</w:t>
+      </w:r>
+    </w:p>
+    <w:p>
+      <w:pPr>
+        <w:rPr>
+          <w:lang w:val="en-US"/>
+        </w:rPr>
+      </w:pPr>
+      <w:r>
+        <w:rPr>
+          <w:lang w:val="en-US"/>
+        </w:rPr>
+        <w:t>The feature store enables centralized management of engineered features, supporting both offline training and online inference use cases. It ensures consistency, traceability, and efficient access to features, forming a critical component of the overall data pipeline.</w:t>
+      </w:r>
+    </w:p>
+    <w:p>
+      <w:pPr>
+        <w:pStyle w:val="Heading1"/>
+        <w:numPr>
+          <w:ilvl w:val="0"/>
+          <w:numId w:val="7"/>
+        </w:numPr>
+        <w:rPr>
+          <w:lang w:val="en-US"/>
+        </w:rPr>
+      </w:pPr>
+      <w:r>
+        <w:rPr>
+          <w:lang w:val="en-US"/>
+        </w:rPr>
+        <w:lastRenderedPageBreak/>
+        <w:t>Data Versioning and Lineage</w:t>
+      </w:r>
+    </w:p>
+    <w:p>
+      <w:pPr>
+        <w:pStyle w:val="Heading2"/>
+        <w:numPr>
+          <w:ilvl w:val="1"/>
+          <w:numId w:val="7"/>
+        </w:numPr>
+        <w:ind w:left="0" w:firstLine="0"/>
+        <w:rPr>
+          <w:lang w:val="en-US"/>
+        </w:rPr>
+      </w:pPr>
+      <w:r>
+        <w:rPr>
+          <w:lang w:val="en-US"/>
+        </w:rPr>
+        <w:t>Overview</w:t>
+      </w:r>
+    </w:p>
+    <w:p>
+      <w:pPr>
+        <w:rPr>
+          <w:lang w:val="en-US"/>
+        </w:rPr>
+      </w:pPr>
+      <w:r>
+        <w:rPr>
+          <w:lang w:val="en-US"/>
+        </w:rPr>
+        <w:t>Data versioning and lineage tracking are implemented to ensure reproducibility, traceability, and transparency of data transformations throughout the pipeline.</w:t>
+      </w:r>
+      <w:r>
+        <w:rPr>
+          <w:lang w:val="en-US"/>
+        </w:rPr>
+        <w:t xml:space="preserve"> </w:t>
+      </w:r>
+      <w:r>
+        <w:rPr>
+          <w:lang w:val="en-US"/>
+        </w:rPr>
+        <w:t>The pipeline processes a configurable active version of each dataset. Version selection is controlled via configuration, enabling flexible switching between dataset versions without modifying code. While only the active version is processed during execution, historical versions are preserved in storage for reproducibility and potential backfill processing.</w:t>
+      </w:r>
+      <w:r>
+        <w:rPr>
+          <w:lang w:val="en-US"/>
+        </w:rPr>
+        <w:t xml:space="preserve"> </w:t>
+      </w:r>
+      <w:r>
+        <w:t>The design can be extended to support multi-version processing for backfill and historical analysis scenarios.</w:t>
+      </w:r>
+    </w:p>
+    <w:p>
+      <w:pPr>
+        <w:pStyle w:val="Heading2"/>
+        <w:numPr>
+          <w:ilvl w:val="1"/>
+          <w:numId w:val="7"/>
+        </w:numPr>
+        <w:ind w:left="0" w:firstLine="0"/>
+        <w:rPr>
+          <w:lang w:val="en-US"/>
+        </w:rPr>
+      </w:pPr>
+      <w:r>
+        <w:rPr>
+          <w:lang w:val="en-US"/>
+        </w:rPr>
+        <w:t>Data Versioning Strategy</w:t>
+      </w:r>
+    </w:p>
+    <w:p>
+      <w:pPr>
+        <w:rPr>
+          <w:lang w:val="en-US"/>
+        </w:rPr>
+      </w:pPr>
+      <w:r>
+        <w:rPr>
+          <w:lang w:val="en-US"/>
+        </w:rPr>
+        <w:t>Datasets are versioned using a combination of:</w:t>
+      </w:r>
+    </w:p>
+    <w:p>
+      <w:pPr>
+        <w:pStyle w:val="ListParagraph"/>
+        <w:numPr>
+          <w:ilvl w:val="0"/>
+          <w:numId w:val="60"/>
+        </w:numPr>
+        <w:rPr>
+          <w:lang w:val="en-US"/>
+        </w:rPr>
+      </w:pPr>
+      <w:r>
+        <w:rPr>
+          <w:lang w:val="en-US"/>
+        </w:rPr>
+        <w:t>Version identifiers (v1, v2, …)</w:t>
+      </w:r>
+    </w:p>
+    <w:p>
+      <w:pPr>
+        <w:pStyle w:val="ListParagraph"/>
+        <w:numPr>
+          <w:ilvl w:val="0"/>
+          <w:numId w:val="60"/>
+        </w:numPr>
+        <w:rPr>
+          <w:lang w:val="en-US"/>
+        </w:rPr>
+      </w:pPr>
+      <w:r>
+        <w:rPr>
+          <w:lang w:val="en-US"/>
+        </w:rPr>
+        <w:t>Date-based partitioning</w:t>
+      </w:r>
+    </w:p>
+    <w:p>
+      <w:pPr>
+        <w:rPr>
+          <w:lang w:val="en-US"/>
+        </w:rPr>
+      </w:pPr>
+      <w:r>
+        <w:rPr>
+          <w:lang w:val="en-US"/>
+        </w:rPr>
+        <w:t>This approach enables tracking of dataset evolution over time and supports reproducibility of experiments.</w:t>
+      </w:r>
+    </w:p>
+    <w:p>
+      <w:pPr>
+        <w:pStyle w:val="Heading2"/>
+        <w:numPr>
+          <w:ilvl w:val="1"/>
+          <w:numId w:val="7"/>
+        </w:numPr>
+        <w:ind w:left="0" w:firstLine="0"/>
+        <w:rPr>
+          <w:lang w:val="en-US"/>
+        </w:rPr>
+      </w:pPr>
+      <w:r>
+        <w:rPr>
+          <w:lang w:val="en-US"/>
+        </w:rPr>
+        <w:t>Storage Structure</w:t>
+      </w:r>
+    </w:p>
+    <w:p>
+      <w:pPr>
+        <w:rPr>
+          <w:lang w:val="en-US"/>
+        </w:rPr>
+      </w:pPr>
+      <w:r>
+        <w:rPr>
+          <w:lang w:val="en-US"/>
+        </w:rPr>
+        <w:t>Raw and processed data are stored in a structured format:</w:t>
+      </w:r>
+    </w:p>
+    <w:p>
+      <w:pPr>
+        <w:pStyle w:val="ListParagraph"/>
+        <w:numPr>
+          <w:ilvl w:val="0"/>
+          <w:numId w:val="61"/>
+        </w:numPr>
+        <w:rPr>
+          <w:lang w:val="en-US"/>
+        </w:rPr>
+      </w:pPr>
+      <w:r>
+        <w:rPr>
+          <w:lang w:val="en-US"/>
+        </w:rPr>
+        <w:t xml:space="preserve">Raw data: </w:t>
+      </w:r>
+      <w:proofErr w:type="spellStart"/>
+      <w:r>
+        <w:rPr>
+          <w:lang w:val="en-US"/>
+        </w:rPr>
+        <w:t>data_lake</w:t>
+      </w:r>
+      <w:proofErr w:type="spellEnd"/>
+      <w:r>
+        <w:rPr>
+          <w:lang w:val="en-US"/>
+        </w:rPr>
+        <w:t>/raw/&lt;dataset&gt;/&lt;version&gt;/&lt;date&gt;/</w:t>
+      </w:r>
+    </w:p>
+    <w:p>
+      <w:pPr>
+        <w:pStyle w:val="ListParagraph"/>
+        <w:numPr>
+          <w:ilvl w:val="0"/>
+          <w:numId w:val="61"/>
+        </w:numPr>
+        <w:rPr>
+          <w:lang w:val="en-US"/>
+        </w:rPr>
+      </w:pPr>
+      <w:r>
+        <w:rPr>
+          <w:lang w:val="en-US"/>
+        </w:rPr>
+        <w:t xml:space="preserve">Processed data: </w:t>
+      </w:r>
+      <w:proofErr w:type="spellStart"/>
+      <w:r>
+        <w:rPr>
+          <w:lang w:val="en-US"/>
+        </w:rPr>
+        <w:t>data_lake</w:t>
+      </w:r>
+      <w:proofErr w:type="spellEnd"/>
+      <w:r>
+        <w:rPr>
+          <w:lang w:val="en-US"/>
+        </w:rPr>
+        <w:t>/processed/features/&lt;version&gt;/</w:t>
+      </w:r>
+    </w:p>
+    <w:p>
+      <w:pPr>
+        <w:pStyle w:val="Heading2"/>
+        <w:numPr>
+          <w:ilvl w:val="1"/>
+          <w:numId w:val="7"/>
+        </w:numPr>
+        <w:ind w:left="0" w:firstLine="0"/>
+        <w:rPr>
+          <w:lang w:val="en-US"/>
+        </w:rPr>
+      </w:pPr>
+      <w:r>
+        <w:rPr>
+          <w:lang w:val="en-US"/>
+        </w:rPr>
+        <w:t>Lineage Tracking</w:t>
+      </w:r>
+    </w:p>
+    <w:p>
+      <w:pPr>
+        <w:rPr>
+          <w:lang w:val="en-US"/>
+        </w:rPr>
+      </w:pPr>
+      <w:r>
+        <w:rPr>
+          <w:lang w:val="en-US"/>
+        </w:rPr>
+        <w:t>A custom lineage tracking mechanism is implemented using a JSON-based registry. Each dataset transformation logs metadata including:</w:t>
+      </w:r>
+    </w:p>
+    <w:p>
+      <w:pPr>
+        <w:pStyle w:val="ListParagraph"/>
+        <w:numPr>
+          <w:ilvl w:val="0"/>
+          <w:numId w:val="62"/>
+        </w:numPr>
+        <w:rPr>
+          <w:lang w:val="en-US"/>
+        </w:rPr>
+      </w:pPr>
+      <w:r>
+        <w:rPr>
+          <w:lang w:val="en-US"/>
+        </w:rPr>
+        <w:t>Data source</w:t>
+      </w:r>
+    </w:p>
+    <w:p>
+      <w:pPr>
+        <w:pStyle w:val="ListParagraph"/>
+        <w:numPr>
+          <w:ilvl w:val="0"/>
+          <w:numId w:val="62"/>
+        </w:numPr>
+        <w:rPr>
+          <w:lang w:val="en-US"/>
+        </w:rPr>
+      </w:pPr>
+      <w:r>
+        <w:rPr>
+          <w:lang w:val="en-US"/>
+        </w:rPr>
+        <w:t>Transformation applied</w:t>
+      </w:r>
+    </w:p>
+    <w:p>
+      <w:pPr>
+        <w:pStyle w:val="ListParagraph"/>
+        <w:numPr>
+          <w:ilvl w:val="0"/>
+          <w:numId w:val="62"/>
+        </w:numPr>
+        <w:rPr>
+          <w:lang w:val="en-US"/>
+        </w:rPr>
+      </w:pPr>
+      <w:r>
+        <w:rPr>
+          <w:lang w:val="en-US"/>
+        </w:rPr>
+        <w:t>Output location</w:t>
+      </w:r>
+    </w:p>
+    <w:p>
+      <w:pPr>
+        <w:pStyle w:val="ListParagraph"/>
+        <w:numPr>
+          <w:ilvl w:val="0"/>
+          <w:numId w:val="62"/>
+        </w:numPr>
+        <w:rPr>
+          <w:lang w:val="en-US"/>
+        </w:rPr>
+      </w:pPr>
+      <w:r>
+        <w:rPr>
+          <w:lang w:val="en-US"/>
+        </w:rPr>
+        <w:t>Timestamp</w:t>
+      </w:r>
+    </w:p>
+    <w:p>
+      <w:pPr>
+        <w:pStyle w:val="Heading2"/>
+        <w:numPr>
+          <w:ilvl w:val="1"/>
+          <w:numId w:val="7"/>
+        </w:numPr>
+        <w:ind w:left="0" w:firstLine="0"/>
+        <w:rPr>
+          <w:lang w:val="en-US"/>
+        </w:rPr>
+      </w:pPr>
+      <w:r>
+        <w:rPr>
+          <w:lang w:val="en-US"/>
+        </w:rPr>
+        <w:t>Lineage Workflow</w:t>
+      </w:r>
+    </w:p>
+    <w:p>
+      <w:pPr>
+        <w:pStyle w:val="ListParagraph"/>
+        <w:numPr>
+          <w:ilvl w:val="0"/>
+          <w:numId w:val="63"/>
+        </w:numPr>
+        <w:rPr>
+          <w:lang w:val="en-US"/>
+        </w:rPr>
+      </w:pPr>
+      <w:r>
+        <w:rPr>
+          <w:lang w:val="en-US"/>
+        </w:rPr>
+        <w:t>Data is ingested and stored in versioned raw folders</w:t>
+      </w:r>
+    </w:p>
+    <w:p>
+      <w:pPr>
+        <w:pStyle w:val="ListParagraph"/>
+        <w:numPr>
+          <w:ilvl w:val="0"/>
+          <w:numId w:val="63"/>
+        </w:numPr>
+        <w:rPr>
+          <w:lang w:val="en-US"/>
+        </w:rPr>
+      </w:pPr>
+      <w:r>
+        <w:rPr>
+          <w:lang w:val="en-US"/>
+        </w:rPr>
+        <w:t>Transformation scripts generate processed datasets</w:t>
+      </w:r>
+    </w:p>
+    <w:p>
+      <w:pPr>
+        <w:pStyle w:val="ListParagraph"/>
+        <w:numPr>
+          <w:ilvl w:val="0"/>
+          <w:numId w:val="63"/>
+        </w:numPr>
+        <w:rPr>
+          <w:lang w:val="en-US"/>
+        </w:rPr>
+      </w:pPr>
+      <w:r>
+        <w:rPr>
+          <w:lang w:val="en-US"/>
+        </w:rPr>
+        <w:t>Each step logs metadata to a lineage registry</w:t>
+      </w:r>
+    </w:p>
+    <w:p>
+      <w:pPr>
+        <w:pStyle w:val="ListParagraph"/>
+        <w:numPr>
+          <w:ilvl w:val="0"/>
+          <w:numId w:val="63"/>
+        </w:numPr>
+        <w:rPr>
+          <w:lang w:val="en-US"/>
+        </w:rPr>
+      </w:pPr>
+      <w:r>
+        <w:rPr>
+          <w:lang w:val="en-US"/>
+        </w:rPr>
+        <w:t>The lineage log provides end-to-end traceability</w:t>
+      </w:r>
+    </w:p>
+    <w:p>
+      <w:pPr>
+        <w:pStyle w:val="Heading2"/>
+        <w:numPr>
+          <w:ilvl w:val="1"/>
+          <w:numId w:val="7"/>
+        </w:numPr>
+        <w:ind w:left="0" w:firstLine="0"/>
+        <w:rPr>
+          <w:lang w:val="en-US"/>
+        </w:rPr>
+      </w:pPr>
+      <w:r>
+        <w:rPr>
+          <w:lang w:val="en-US"/>
+        </w:rPr>
+        <w:lastRenderedPageBreak/>
+        <w:t>Tooling and Justification</w:t>
+      </w:r>
+    </w:p>
+    <w:p>
+      <w:pPr>
+        <w:rPr>
+          <w:lang w:val="en-US"/>
+        </w:rPr>
+      </w:pPr>
+      <w:r>
+        <w:rPr>
+          <w:lang w:val="en-US"/>
+        </w:rPr>
+        <w:t>While tools such as DVC and Git LFS are commonly used for data versioning, a lightweight custom implementation is used in this project to:</w:t>
+      </w:r>
+    </w:p>
+    <w:p>
+      <w:pPr>
+        <w:pStyle w:val="ListParagraph"/>
+        <w:numPr>
+          <w:ilvl w:val="0"/>
+          <w:numId w:val="64"/>
+        </w:numPr>
+        <w:rPr>
+          <w:lang w:val="en-US"/>
+        </w:rPr>
+      </w:pPr>
+      <w:r>
+        <w:rPr>
+          <w:lang w:val="en-US"/>
+        </w:rPr>
+        <w:t>Reduce setup complexity</w:t>
+      </w:r>
+    </w:p>
+    <w:p>
+      <w:pPr>
+        <w:pStyle w:val="ListParagraph"/>
+        <w:numPr>
+          <w:ilvl w:val="0"/>
+          <w:numId w:val="64"/>
+        </w:numPr>
+        <w:rPr>
+          <w:lang w:val="en-US"/>
+        </w:rPr>
+      </w:pPr>
+      <w:r>
+        <w:rPr>
+          <w:lang w:val="en-US"/>
+        </w:rPr>
+        <w:t>Maintain reproducibility</w:t>
+      </w:r>
+    </w:p>
+    <w:p>
+      <w:pPr>
+        <w:pStyle w:val="ListParagraph"/>
+        <w:numPr>
+          <w:ilvl w:val="0"/>
+          <w:numId w:val="64"/>
+        </w:numPr>
+        <w:rPr>
+          <w:lang w:val="en-US"/>
+        </w:rPr>
+      </w:pPr>
+      <w:r>
+        <w:rPr>
+          <w:lang w:val="en-US"/>
+        </w:rPr>
+        <w:t>Align with assignment constraints</w:t>
+      </w:r>
+    </w:p>
+    <w:p>
+      <w:pPr>
+        <w:pStyle w:val="Heading2"/>
+        <w:numPr>
+          <w:ilvl w:val="1"/>
+          <w:numId w:val="7"/>
+        </w:numPr>
+        <w:ind w:left="0" w:firstLine="0"/>
+        <w:rPr>
+          <w:lang w:val="en-US"/>
+        </w:rPr>
+      </w:pPr>
+      <w:r>
+        <w:rPr>
+          <w:lang w:val="en-US"/>
+        </w:rPr>
+        <w:t>Summary</w:t>
+      </w:r>
+    </w:p>
+    <w:p>
+      <w:pPr>
+        <w:rPr>
+          <w:lang w:val="en-US"/>
+        </w:rPr>
+      </w:pPr>
+      <w:r>
+        <w:rPr>
+          <w:lang w:val="en-US"/>
+        </w:rPr>
+        <w:t>The implemented versioning and lineage framework ensures:</w:t>
+      </w:r>
+    </w:p>
+    <w:p>
+      <w:pPr>
+        <w:pStyle w:val="ListParagraph"/>
+        <w:numPr>
+          <w:ilvl w:val="0"/>
+          <w:numId w:val="65"/>
+        </w:numPr>
+        <w:rPr>
+          <w:lang w:val="en-US"/>
+        </w:rPr>
+      </w:pPr>
+      <w:r>
+        <w:rPr>
+          <w:lang w:val="en-US"/>
+        </w:rPr>
+        <w:t>Reproducibility of datasets and features</w:t>
+      </w:r>
+    </w:p>
+    <w:p>
+      <w:pPr>
+        <w:pStyle w:val="ListParagraph"/>
+        <w:numPr>
+          <w:ilvl w:val="0"/>
+          <w:numId w:val="65"/>
+        </w:numPr>
+        <w:rPr>
+          <w:lang w:val="en-US"/>
+        </w:rPr>
+      </w:pPr>
+      <w:r>
+        <w:rPr>
+          <w:lang w:val="en-US"/>
+        </w:rPr>
+        <w:t>Traceability of transformations</w:t>
+      </w:r>
+    </w:p>
+    <w:p>
+      <w:pPr>
+        <w:pStyle w:val="ListParagraph"/>
+        <w:numPr>
+          <w:ilvl w:val="0"/>
+          <w:numId w:val="65"/>
+        </w:numPr>
+        <w:rPr>
+          <w:lang w:val="en-US"/>
+        </w:rPr>
+      </w:pPr>
+      <w:r>
+        <w:rPr>
+          <w:lang w:val="en-US"/>
+        </w:rPr>
+        <w:t>Transparency in data flow</w:t>
+      </w:r>
+    </w:p>
+    <w:p>
+      <w:pPr>
+        <w:rPr>
+          <w:lang w:val="en-US"/>
+        </w:rPr>
+      </w:pPr>
+      <w:r>
+        <w:rPr>
+          <w:lang w:val="en-US"/>
+        </w:rPr>
+        <w:t>This forms a critical foundation for reliable machine learning pipelines.</w:t>
+      </w:r>
     </w:p>
     <w:sectPr>
       <w:pgSz w:w="11906" w:h="16838"/>
@@ -9227,6 +10656,119 @@
     </w:lvl>
   </w:abstractNum>
   <w:abstractNum w:abstractNumId="8" w15:restartNumberingAfterBreak="0">
+    <w:nsid w:val="181A6476"/>
+    <w:multiLevelType w:val="hybridMultilevel"/>
+    <w:tmpl w:val="BC6E727E"/>
+    <w:lvl w:ilvl="0" w:tplc="40090001">
+      <w:start w:val="1"/>
+      <w:numFmt w:val="bullet"/>
+      <w:lvlText w:val=""/>
+      <w:lvlJc w:val="left"/>
+      <w:pPr>
+        <w:ind w:left="720" w:hanging="360"/>
+      </w:pPr>
+      <w:rPr>
+        <w:rFonts w:ascii="Symbol" w:hAnsi="Symbol" w:hint="default"/>
+      </w:rPr>
+    </w:lvl>
+    <w:lvl w:ilvl="1" w:tplc="40090003" w:tentative="1">
+      <w:start w:val="1"/>
+      <w:numFmt w:val="bullet"/>
+      <w:lvlText w:val="o"/>
+      <w:lvlJc w:val="left"/>
+      <w:pPr>
+        <w:ind w:left="1440" w:hanging="360"/>
+      </w:pPr>
+      <w:rPr>
+        <w:rFonts w:ascii="Courier New" w:hAnsi="Courier New" w:cs="Courier New" w:hint="default"/>
+      </w:rPr>
+    </w:lvl>
+    <w:lvl w:ilvl="2" w:tplc="40090005" w:tentative="1">
+      <w:start w:val="1"/>
+      <w:numFmt w:val="bullet"/>
+      <w:lvlText w:val=""/>
+      <w:lvlJc w:val="left"/>
+      <w:pPr>
+        <w:ind w:left="2160" w:hanging="360"/>
+      </w:pPr>
+      <w:rPr>
+        <w:rFonts w:ascii="Wingdings" w:hAnsi="Wingdings" w:hint="default"/>
+      </w:rPr>
+    </w:lvl>
+    <w:lvl w:ilvl="3" w:tplc="40090001" w:tentative="1">
+      <w:start w:val="1"/>
+      <w:numFmt w:val="bullet"/>
+      <w:lvlText w:val=""/>
+      <w:lvlJc w:val="left"/>
+      <w:pPr>
+        <w:ind w:left="2880" w:hanging="360"/>
+      </w:pPr>
+      <w:rPr>
+        <w:rFonts w:ascii="Symbol" w:hAnsi="Symbol" w:hint="default"/>
+      </w:rPr>
+    </w:lvl>
+    <w:lvl w:ilvl="4" w:tplc="40090003" w:tentative="1">
+      <w:start w:val="1"/>
+      <w:numFmt w:val="bullet"/>
+      <w:lvlText w:val="o"/>
+      <w:lvlJc w:val="left"/>
+      <w:pPr>
+        <w:ind w:left="3600" w:hanging="360"/>
+      </w:pPr>
+      <w:rPr>
+        <w:rFonts w:ascii="Courier New" w:hAnsi="Courier New" w:cs="Courier New" w:hint="default"/>
+      </w:rPr>
+    </w:lvl>
+    <w:lvl w:ilvl="5" w:tplc="40090005" w:tentative="1">
+      <w:start w:val="1"/>
+      <w:numFmt w:val="bullet"/>
+      <w:lvlText w:val=""/>
+      <w:lvlJc w:val="left"/>
+      <w:pPr>
+        <w:ind w:left="4320" w:hanging="360"/>
+      </w:pPr>
+      <w:rPr>
+        <w:rFonts w:ascii="Wingdings" w:hAnsi="Wingdings" w:hint="default"/>
+      </w:rPr>
+    </w:lvl>
+    <w:lvl w:ilvl="6" w:tplc="40090001" w:tentative="1">
+      <w:start w:val="1"/>
+      <w:numFmt w:val="bullet"/>
+      <w:lvlText w:val=""/>
+      <w:lvlJc w:val="left"/>
+      <w:pPr>
+        <w:ind w:left="5040" w:hanging="360"/>
+      </w:pPr>
+      <w:rPr>
+        <w:rFonts w:ascii="Symbol" w:hAnsi="Symbol" w:hint="default"/>
+      </w:rPr>
+    </w:lvl>
+    <w:lvl w:ilvl="7" w:tplc="40090003" w:tentative="1">
+      <w:start w:val="1"/>
+      <w:numFmt w:val="bullet"/>
+      <w:lvlText w:val="o"/>
+      <w:lvlJc w:val="left"/>
+      <w:pPr>
+        <w:ind w:left="5760" w:hanging="360"/>
+      </w:pPr>
+      <w:rPr>
+        <w:rFonts w:ascii="Courier New" w:hAnsi="Courier New" w:cs="Courier New" w:hint="default"/>
+      </w:rPr>
+    </w:lvl>
+    <w:lvl w:ilvl="8" w:tplc="40090005" w:tentative="1">
+      <w:start w:val="1"/>
+      <w:numFmt w:val="bullet"/>
+      <w:lvlText w:val=""/>
+      <w:lvlJc w:val="left"/>
+      <w:pPr>
+        <w:ind w:left="6480" w:hanging="360"/>
+      </w:pPr>
+      <w:rPr>
+        <w:rFonts w:ascii="Wingdings" w:hAnsi="Wingdings" w:hint="default"/>
+      </w:rPr>
+    </w:lvl>
+  </w:abstractNum>
+  <w:abstractNum w:abstractNumId="9" w15:restartNumberingAfterBreak="0">
     <w:nsid w:val="18A36030"/>
     <w:multiLevelType w:val="hybridMultilevel"/>
     <w:tmpl w:val="AAE227A4"/>
@@ -9339,7 +10881,7 @@
       </w:rPr>
     </w:lvl>
   </w:abstractNum>
-  <w:abstractNum w:abstractNumId="9" w15:restartNumberingAfterBreak="0">
+  <w:abstractNum w:abstractNumId="10" w15:restartNumberingAfterBreak="0">
     <w:nsid w:val="1936633C"/>
     <w:multiLevelType w:val="hybridMultilevel"/>
     <w:tmpl w:val="88A6EA06"/>
@@ -9452,7 +10994,7 @@
       </w:rPr>
     </w:lvl>
   </w:abstractNum>
-  <w:abstractNum w:abstractNumId="10" w15:restartNumberingAfterBreak="0">
+  <w:abstractNum w:abstractNumId="11" w15:restartNumberingAfterBreak="0">
     <w:nsid w:val="1B1351DB"/>
     <w:multiLevelType w:val="multilevel"/>
     <w:tmpl w:val="AF8650FA"/>
@@ -9547,7 +11089,7 @@
       </w:pPr>
     </w:lvl>
   </w:abstractNum>
-  <w:abstractNum w:abstractNumId="11" w15:restartNumberingAfterBreak="0">
+  <w:abstractNum w:abstractNumId="12" w15:restartNumberingAfterBreak="0">
     <w:nsid w:val="1E7702BB"/>
     <w:multiLevelType w:val="hybridMultilevel"/>
     <w:tmpl w:val="C66807EE"/>
@@ -9660,7 +11202,7 @@
       </w:rPr>
     </w:lvl>
   </w:abstractNum>
-  <w:abstractNum w:abstractNumId="12" w15:restartNumberingAfterBreak="0">
+  <w:abstractNum w:abstractNumId="13" w15:restartNumberingAfterBreak="0">
     <w:nsid w:val="1E89188C"/>
     <w:multiLevelType w:val="hybridMultilevel"/>
     <w:tmpl w:val="B1D26A7E"/>
@@ -9773,7 +11315,7 @@
       </w:rPr>
     </w:lvl>
   </w:abstractNum>
-  <w:abstractNum w:abstractNumId="13" w15:restartNumberingAfterBreak="0">
+  <w:abstractNum w:abstractNumId="14" w15:restartNumberingAfterBreak="0">
     <w:nsid w:val="1EC762B4"/>
     <w:multiLevelType w:val="multilevel"/>
     <w:tmpl w:val="59265CBE"/>
@@ -9862,7 +11404,120 @@
       </w:pPr>
     </w:lvl>
   </w:abstractNum>
-  <w:abstractNum w:abstractNumId="14" w15:restartNumberingAfterBreak="0">
+  <w:abstractNum w:abstractNumId="15" w15:restartNumberingAfterBreak="0">
+    <w:nsid w:val="1F01266A"/>
+    <w:multiLevelType w:val="hybridMultilevel"/>
+    <w:tmpl w:val="B1D01DD4"/>
+    <w:lvl w:ilvl="0" w:tplc="40090001">
+      <w:start w:val="1"/>
+      <w:numFmt w:val="bullet"/>
+      <w:lvlText w:val=""/>
+      <w:lvlJc w:val="left"/>
+      <w:pPr>
+        <w:ind w:left="720" w:hanging="360"/>
+      </w:pPr>
+      <w:rPr>
+        <w:rFonts w:ascii="Symbol" w:hAnsi="Symbol" w:hint="default"/>
+      </w:rPr>
+    </w:lvl>
+    <w:lvl w:ilvl="1" w:tplc="40090003" w:tentative="1">
+      <w:start w:val="1"/>
+      <w:numFmt w:val="bullet"/>
+      <w:lvlText w:val="o"/>
+      <w:lvlJc w:val="left"/>
+      <w:pPr>
+        <w:ind w:left="1440" w:hanging="360"/>
+      </w:pPr>
+      <w:rPr>
+        <w:rFonts w:ascii="Courier New" w:hAnsi="Courier New" w:cs="Courier New" w:hint="default"/>
+      </w:rPr>
+    </w:lvl>
+    <w:lvl w:ilvl="2" w:tplc="40090005" w:tentative="1">
+      <w:start w:val="1"/>
+      <w:numFmt w:val="bullet"/>
+      <w:lvlText w:val=""/>
+      <w:lvlJc w:val="left"/>
+      <w:pPr>
+        <w:ind w:left="2160" w:hanging="360"/>
+      </w:pPr>
+      <w:rPr>
+        <w:rFonts w:ascii="Wingdings" w:hAnsi="Wingdings" w:hint="default"/>
+      </w:rPr>
+    </w:lvl>
+    <w:lvl w:ilvl="3" w:tplc="40090001" w:tentative="1">
+      <w:start w:val="1"/>
+      <w:numFmt w:val="bullet"/>
+      <w:lvlText w:val=""/>
+      <w:lvlJc w:val="left"/>
+      <w:pPr>
+        <w:ind w:left="2880" w:hanging="360"/>
+      </w:pPr>
+      <w:rPr>
+        <w:rFonts w:ascii="Symbol" w:hAnsi="Symbol" w:hint="default"/>
+      </w:rPr>
+    </w:lvl>
+    <w:lvl w:ilvl="4" w:tplc="40090003" w:tentative="1">
+      <w:start w:val="1"/>
+      <w:numFmt w:val="bullet"/>
+      <w:lvlText w:val="o"/>
+      <w:lvlJc w:val="left"/>
+      <w:pPr>
+        <w:ind w:left="3600" w:hanging="360"/>
+      </w:pPr>
+      <w:rPr>
+        <w:rFonts w:ascii="Courier New" w:hAnsi="Courier New" w:cs="Courier New" w:hint="default"/>
+      </w:rPr>
+    </w:lvl>
+    <w:lvl w:ilvl="5" w:tplc="40090005" w:tentative="1">
+      <w:start w:val="1"/>
+      <w:numFmt w:val="bullet"/>
+      <w:lvlText w:val=""/>
+      <w:lvlJc w:val="left"/>
+      <w:pPr>
+        <w:ind w:left="4320" w:hanging="360"/>
+      </w:pPr>
+      <w:rPr>
+        <w:rFonts w:ascii="Wingdings" w:hAnsi="Wingdings" w:hint="default"/>
+      </w:rPr>
+    </w:lvl>
+    <w:lvl w:ilvl="6" w:tplc="40090001" w:tentative="1">
+      <w:start w:val="1"/>
+      <w:numFmt w:val="bullet"/>
+      <w:lvlText w:val=""/>
+      <w:lvlJc w:val="left"/>
+      <w:pPr>
+        <w:ind w:left="5040" w:hanging="360"/>
+      </w:pPr>
+      <w:rPr>
+        <w:rFonts w:ascii="Symbol" w:hAnsi="Symbol" w:hint="default"/>
+      </w:rPr>
+    </w:lvl>
+    <w:lvl w:ilvl="7" w:tplc="40090003" w:tentative="1">
+      <w:start w:val="1"/>
+      <w:numFmt w:val="bullet"/>
+      <w:lvlText w:val="o"/>
+      <w:lvlJc w:val="left"/>
+      <w:pPr>
+        <w:ind w:left="5760" w:hanging="360"/>
+      </w:pPr>
+      <w:rPr>
+        <w:rFonts w:ascii="Courier New" w:hAnsi="Courier New" w:cs="Courier New" w:hint="default"/>
+      </w:rPr>
+    </w:lvl>
+    <w:lvl w:ilvl="8" w:tplc="40090005" w:tentative="1">
+      <w:start w:val="1"/>
+      <w:numFmt w:val="bullet"/>
+      <w:lvlText w:val=""/>
+      <w:lvlJc w:val="left"/>
+      <w:pPr>
+        <w:ind w:left="6480" w:hanging="360"/>
+      </w:pPr>
+      <w:rPr>
+        <w:rFonts w:ascii="Wingdings" w:hAnsi="Wingdings" w:hint="default"/>
+      </w:rPr>
+    </w:lvl>
+  </w:abstractNum>
+  <w:abstractNum w:abstractNumId="16" w15:restartNumberingAfterBreak="0">
     <w:nsid w:val="21697168"/>
     <w:multiLevelType w:val="multilevel"/>
     <w:tmpl w:val="4009001F"/>
@@ -9948,7 +11603,7 @@
       </w:pPr>
     </w:lvl>
   </w:abstractNum>
-  <w:abstractNum w:abstractNumId="15" w15:restartNumberingAfterBreak="0">
+  <w:abstractNum w:abstractNumId="17" w15:restartNumberingAfterBreak="0">
     <w:nsid w:val="2237450F"/>
     <w:multiLevelType w:val="multilevel"/>
     <w:tmpl w:val="15408114"/>
@@ -10061,7 +11716,7 @@
       </w:rPr>
     </w:lvl>
   </w:abstractNum>
-  <w:abstractNum w:abstractNumId="16" w15:restartNumberingAfterBreak="0">
+  <w:abstractNum w:abstractNumId="18" w15:restartNumberingAfterBreak="0">
     <w:nsid w:val="23EC5BAB"/>
     <w:multiLevelType w:val="hybridMultilevel"/>
     <w:tmpl w:val="03DECD06"/>
@@ -10174,7 +11829,120 @@
       </w:rPr>
     </w:lvl>
   </w:abstractNum>
-  <w:abstractNum w:abstractNumId="17" w15:restartNumberingAfterBreak="0">
+  <w:abstractNum w:abstractNumId="19" w15:restartNumberingAfterBreak="0">
+    <w:nsid w:val="243A6F17"/>
+    <w:multiLevelType w:val="hybridMultilevel"/>
+    <w:tmpl w:val="4C780D88"/>
+    <w:lvl w:ilvl="0" w:tplc="40090001">
+      <w:start w:val="1"/>
+      <w:numFmt w:val="bullet"/>
+      <w:lvlText w:val=""/>
+      <w:lvlJc w:val="left"/>
+      <w:pPr>
+        <w:ind w:left="720" w:hanging="360"/>
+      </w:pPr>
+      <w:rPr>
+        <w:rFonts w:ascii="Symbol" w:hAnsi="Symbol" w:hint="default"/>
+      </w:rPr>
+    </w:lvl>
+    <w:lvl w:ilvl="1" w:tplc="40090003" w:tentative="1">
+      <w:start w:val="1"/>
+      <w:numFmt w:val="bullet"/>
+      <w:lvlText w:val="o"/>
+      <w:lvlJc w:val="left"/>
+      <w:pPr>
+        <w:ind w:left="1440" w:hanging="360"/>
+      </w:pPr>
+      <w:rPr>
+        <w:rFonts w:ascii="Courier New" w:hAnsi="Courier New" w:cs="Courier New" w:hint="default"/>
+      </w:rPr>
+    </w:lvl>
+    <w:lvl w:ilvl="2" w:tplc="40090005" w:tentative="1">
+      <w:start w:val="1"/>
+      <w:numFmt w:val="bullet"/>
+      <w:lvlText w:val=""/>
+      <w:lvlJc w:val="left"/>
+      <w:pPr>
+        <w:ind w:left="2160" w:hanging="360"/>
+      </w:pPr>
+      <w:rPr>
+        <w:rFonts w:ascii="Wingdings" w:hAnsi="Wingdings" w:hint="default"/>
+      </w:rPr>
+    </w:lvl>
+    <w:lvl w:ilvl="3" w:tplc="40090001" w:tentative="1">
+      <w:start w:val="1"/>
+      <w:numFmt w:val="bullet"/>
+      <w:lvlText w:val=""/>
+      <w:lvlJc w:val="left"/>
+      <w:pPr>
+        <w:ind w:left="2880" w:hanging="360"/>
+      </w:pPr>
+      <w:rPr>
+        <w:rFonts w:ascii="Symbol" w:hAnsi="Symbol" w:hint="default"/>
+      </w:rPr>
+    </w:lvl>
+    <w:lvl w:ilvl="4" w:tplc="40090003" w:tentative="1">
+      <w:start w:val="1"/>
+      <w:numFmt w:val="bullet"/>
+      <w:lvlText w:val="o"/>
+      <w:lvlJc w:val="left"/>
+      <w:pPr>
+        <w:ind w:left="3600" w:hanging="360"/>
+      </w:pPr>
+      <w:rPr>
+        <w:rFonts w:ascii="Courier New" w:hAnsi="Courier New" w:cs="Courier New" w:hint="default"/>
+      </w:rPr>
+    </w:lvl>
+    <w:lvl w:ilvl="5" w:tplc="40090005" w:tentative="1">
+      <w:start w:val="1"/>
+      <w:numFmt w:val="bullet"/>
+      <w:lvlText w:val=""/>
+      <w:lvlJc w:val="left"/>
+      <w:pPr>
+        <w:ind w:left="4320" w:hanging="360"/>
+      </w:pPr>
+      <w:rPr>
+        <w:rFonts w:ascii="Wingdings" w:hAnsi="Wingdings" w:hint="default"/>
+      </w:rPr>
+    </w:lvl>
+    <w:lvl w:ilvl="6" w:tplc="40090001" w:tentative="1">
+      <w:start w:val="1"/>
+      <w:numFmt w:val="bullet"/>
+      <w:lvlText w:val=""/>
+      <w:lvlJc w:val="left"/>
+      <w:pPr>
+        <w:ind w:left="5040" w:hanging="360"/>
+      </w:pPr>
+      <w:rPr>
+        <w:rFonts w:ascii="Symbol" w:hAnsi="Symbol" w:hint="default"/>
+      </w:rPr>
+    </w:lvl>
+    <w:lvl w:ilvl="7" w:tplc="40090003" w:tentative="1">
+      <w:start w:val="1"/>
+      <w:numFmt w:val="bullet"/>
+      <w:lvlText w:val="o"/>
+      <w:lvlJc w:val="left"/>
+      <w:pPr>
+        <w:ind w:left="5760" w:hanging="360"/>
+      </w:pPr>
+      <w:rPr>
+        <w:rFonts w:ascii="Courier New" w:hAnsi="Courier New" w:cs="Courier New" w:hint="default"/>
+      </w:rPr>
+    </w:lvl>
+    <w:lvl w:ilvl="8" w:tplc="40090005" w:tentative="1">
+      <w:start w:val="1"/>
+      <w:numFmt w:val="bullet"/>
+      <w:lvlText w:val=""/>
+      <w:lvlJc w:val="left"/>
+      <w:pPr>
+        <w:ind w:left="6480" w:hanging="360"/>
+      </w:pPr>
+      <w:rPr>
+        <w:rFonts w:ascii="Wingdings" w:hAnsi="Wingdings" w:hint="default"/>
+      </w:rPr>
+    </w:lvl>
+  </w:abstractNum>
+  <w:abstractNum w:abstractNumId="20" w15:restartNumberingAfterBreak="0">
     <w:nsid w:val="247E1E72"/>
     <w:multiLevelType w:val="hybridMultilevel"/>
     <w:tmpl w:val="85A202F8"/>
@@ -10263,7 +12031,7 @@
       </w:pPr>
     </w:lvl>
   </w:abstractNum>
-  <w:abstractNum w:abstractNumId="18" w15:restartNumberingAfterBreak="0">
+  <w:abstractNum w:abstractNumId="21" w15:restartNumberingAfterBreak="0">
     <w:nsid w:val="31302F2A"/>
     <w:multiLevelType w:val="multilevel"/>
     <w:tmpl w:val="AF8650FA"/>
@@ -10358,7 +12126,7 @@
       </w:pPr>
     </w:lvl>
   </w:abstractNum>
-  <w:abstractNum w:abstractNumId="19" w15:restartNumberingAfterBreak="0">
+  <w:abstractNum w:abstractNumId="22" w15:restartNumberingAfterBreak="0">
     <w:nsid w:val="33B67CAC"/>
     <w:multiLevelType w:val="multilevel"/>
     <w:tmpl w:val="4009001F"/>
@@ -10444,7 +12212,7 @@
       </w:pPr>
     </w:lvl>
   </w:abstractNum>
-  <w:abstractNum w:abstractNumId="20" w15:restartNumberingAfterBreak="0">
+  <w:abstractNum w:abstractNumId="23" w15:restartNumberingAfterBreak="0">
     <w:nsid w:val="393D0DF4"/>
     <w:multiLevelType w:val="multilevel"/>
     <w:tmpl w:val="A43E5F90"/>
@@ -10533,7 +12301,120 @@
       </w:pPr>
     </w:lvl>
   </w:abstractNum>
-  <w:abstractNum w:abstractNumId="21" w15:restartNumberingAfterBreak="0">
+  <w:abstractNum w:abstractNumId="24" w15:restartNumberingAfterBreak="0">
+    <w:nsid w:val="3F4206B9"/>
+    <w:multiLevelType w:val="hybridMultilevel"/>
+    <w:tmpl w:val="50C050BC"/>
+    <w:lvl w:ilvl="0" w:tplc="40090001">
+      <w:start w:val="1"/>
+      <w:numFmt w:val="bullet"/>
+      <w:lvlText w:val=""/>
+      <w:lvlJc w:val="left"/>
+      <w:pPr>
+        <w:ind w:left="720" w:hanging="360"/>
+      </w:pPr>
+      <w:rPr>
+        <w:rFonts w:ascii="Symbol" w:hAnsi="Symbol" w:hint="default"/>
+      </w:rPr>
+    </w:lvl>
+    <w:lvl w:ilvl="1" w:tplc="40090003" w:tentative="1">
+      <w:start w:val="1"/>
+      <w:numFmt w:val="bullet"/>
+      <w:lvlText w:val="o"/>
+      <w:lvlJc w:val="left"/>
+      <w:pPr>
+        <w:ind w:left="1440" w:hanging="360"/>
+      </w:pPr>
+      <w:rPr>
+        <w:rFonts w:ascii="Courier New" w:hAnsi="Courier New" w:cs="Courier New" w:hint="default"/>
+      </w:rPr>
+    </w:lvl>
+    <w:lvl w:ilvl="2" w:tplc="40090005" w:tentative="1">
+      <w:start w:val="1"/>
+      <w:numFmt w:val="bullet"/>
+      <w:lvlText w:val=""/>
+      <w:lvlJc w:val="left"/>
+      <w:pPr>
+        <w:ind w:left="2160" w:hanging="360"/>
+      </w:pPr>
+      <w:rPr>
+        <w:rFonts w:ascii="Wingdings" w:hAnsi="Wingdings" w:hint="default"/>
+      </w:rPr>
+    </w:lvl>
+    <w:lvl w:ilvl="3" w:tplc="40090001" w:tentative="1">
+      <w:start w:val="1"/>
+      <w:numFmt w:val="bullet"/>
+      <w:lvlText w:val=""/>
+      <w:lvlJc w:val="left"/>
+      <w:pPr>
+        <w:ind w:left="2880" w:hanging="360"/>
+      </w:pPr>
+      <w:rPr>
+        <w:rFonts w:ascii="Symbol" w:hAnsi="Symbol" w:hint="default"/>
+      </w:rPr>
+    </w:lvl>
+    <w:lvl w:ilvl="4" w:tplc="40090003" w:tentative="1">
+      <w:start w:val="1"/>
+      <w:numFmt w:val="bullet"/>
+      <w:lvlText w:val="o"/>
+      <w:lvlJc w:val="left"/>
+      <w:pPr>
+        <w:ind w:left="3600" w:hanging="360"/>
+      </w:pPr>
+      <w:rPr>
+        <w:rFonts w:ascii="Courier New" w:hAnsi="Courier New" w:cs="Courier New" w:hint="default"/>
+      </w:rPr>
+    </w:lvl>
+    <w:lvl w:ilvl="5" w:tplc="40090005" w:tentative="1">
+      <w:start w:val="1"/>
+      <w:numFmt w:val="bullet"/>
+      <w:lvlText w:val=""/>
+      <w:lvlJc w:val="left"/>
+      <w:pPr>
+        <w:ind w:left="4320" w:hanging="360"/>
+      </w:pPr>
+      <w:rPr>
+        <w:rFonts w:ascii="Wingdings" w:hAnsi="Wingdings" w:hint="default"/>
+      </w:rPr>
+    </w:lvl>
+    <w:lvl w:ilvl="6" w:tplc="40090001" w:tentative="1">
+      <w:start w:val="1"/>
+      <w:numFmt w:val="bullet"/>
+      <w:lvlText w:val=""/>
+      <w:lvlJc w:val="left"/>
+      <w:pPr>
+        <w:ind w:left="5040" w:hanging="360"/>
+      </w:pPr>
+      <w:rPr>
+        <w:rFonts w:ascii="Symbol" w:hAnsi="Symbol" w:hint="default"/>
+      </w:rPr>
+    </w:lvl>
+    <w:lvl w:ilvl="7" w:tplc="40090003" w:tentative="1">
+      <w:start w:val="1"/>
+      <w:numFmt w:val="bullet"/>
+      <w:lvlText w:val="o"/>
+      <w:lvlJc w:val="left"/>
+      <w:pPr>
+        <w:ind w:left="5760" w:hanging="360"/>
+      </w:pPr>
+      <w:rPr>
+        <w:rFonts w:ascii="Courier New" w:hAnsi="Courier New" w:cs="Courier New" w:hint="default"/>
+      </w:rPr>
+    </w:lvl>
+    <w:lvl w:ilvl="8" w:tplc="40090005" w:tentative="1">
+      <w:start w:val="1"/>
+      <w:numFmt w:val="bullet"/>
+      <w:lvlText w:val=""/>
+      <w:lvlJc w:val="left"/>
+      <w:pPr>
+        <w:ind w:left="6480" w:hanging="360"/>
+      </w:pPr>
+      <w:rPr>
+        <w:rFonts w:ascii="Wingdings" w:hAnsi="Wingdings" w:hint="default"/>
+      </w:rPr>
+    </w:lvl>
+  </w:abstractNum>
+  <w:abstractNum w:abstractNumId="25" w15:restartNumberingAfterBreak="0">
     <w:nsid w:val="418432CC"/>
     <w:multiLevelType w:val="multilevel"/>
     <w:tmpl w:val="0EA41B88"/>
@@ -10628,7 +12509,7 @@
       </w:pPr>
     </w:lvl>
   </w:abstractNum>
-  <w:abstractNum w:abstractNumId="22" w15:restartNumberingAfterBreak="0">
+  <w:abstractNum w:abstractNumId="26" w15:restartNumberingAfterBreak="0">
     <w:nsid w:val="460E4141"/>
     <w:multiLevelType w:val="hybridMultilevel"/>
     <w:tmpl w:val="23C46E06"/>
@@ -10741,7 +12622,7 @@
       </w:rPr>
     </w:lvl>
   </w:abstractNum>
-  <w:abstractNum w:abstractNumId="23" w15:restartNumberingAfterBreak="0">
+  <w:abstractNum w:abstractNumId="27" w15:restartNumberingAfterBreak="0">
     <w:nsid w:val="4AAB387A"/>
     <w:multiLevelType w:val="multilevel"/>
     <w:tmpl w:val="72DC0442"/>
@@ -10833,7 +12714,7 @@
       </w:pPr>
     </w:lvl>
   </w:abstractNum>
-  <w:abstractNum w:abstractNumId="24" w15:restartNumberingAfterBreak="0">
+  <w:abstractNum w:abstractNumId="28" w15:restartNumberingAfterBreak="0">
     <w:nsid w:val="4C633A2A"/>
     <w:multiLevelType w:val="multilevel"/>
     <w:tmpl w:val="4B603932"/>
@@ -10946,7 +12827,209 @@
       </w:rPr>
     </w:lvl>
   </w:abstractNum>
-  <w:abstractNum w:abstractNumId="25" w15:restartNumberingAfterBreak="0">
+  <w:abstractNum w:abstractNumId="29" w15:restartNumberingAfterBreak="0">
+    <w:nsid w:val="4D784B02"/>
+    <w:multiLevelType w:val="multilevel"/>
+    <w:tmpl w:val="59265CBE"/>
+    <w:lvl w:ilvl="0">
+      <w:start w:val="1"/>
+      <w:numFmt w:val="decimal"/>
+      <w:lvlText w:val="%1."/>
+      <w:lvlJc w:val="left"/>
+      <w:pPr>
+        <w:ind w:left="360" w:hanging="360"/>
+      </w:pPr>
+    </w:lvl>
+    <w:lvl w:ilvl="1">
+      <w:start w:val="1"/>
+      <w:numFmt w:val="decimal"/>
+      <w:lvlText w:val="%1.%2."/>
+      <w:lvlJc w:val="left"/>
+      <w:pPr>
+        <w:ind w:left="792" w:hanging="432"/>
+      </w:pPr>
+    </w:lvl>
+    <w:lvl w:ilvl="2">
+      <w:start w:val="1"/>
+      <w:numFmt w:val="bullet"/>
+      <w:lvlText w:val=""/>
+      <w:lvlJc w:val="left"/>
+      <w:pPr>
+        <w:ind w:left="1080" w:hanging="360"/>
+      </w:pPr>
+      <w:rPr>
+        <w:rFonts w:ascii="Symbol" w:hAnsi="Symbol" w:hint="default"/>
+      </w:rPr>
+    </w:lvl>
+    <w:lvl w:ilvl="3">
+      <w:start w:val="1"/>
+      <w:numFmt w:val="decimal"/>
+      <w:lvlText w:val="%1.%2.%3.%4."/>
+      <w:lvlJc w:val="left"/>
+      <w:pPr>
+        <w:ind w:left="1728" w:hanging="648"/>
+      </w:pPr>
+    </w:lvl>
+    <w:lvl w:ilvl="4">
+      <w:start w:val="1"/>
+      <w:numFmt w:val="decimal"/>
+      <w:lvlText w:val="%1.%2.%3.%4.%5."/>
+      <w:lvlJc w:val="left"/>
+      <w:pPr>
+        <w:ind w:left="2232" w:hanging="792"/>
+      </w:pPr>
+    </w:lvl>
+    <w:lvl w:ilvl="5">
+      <w:start w:val="1"/>
+      <w:numFmt w:val="decimal"/>
+      <w:lvlText w:val="%1.%2.%3.%4.%5.%6."/>
+      <w:lvlJc w:val="left"/>
+      <w:pPr>
+        <w:ind w:left="2736" w:hanging="936"/>
+      </w:pPr>
+    </w:lvl>
+    <w:lvl w:ilvl="6">
+      <w:start w:val="1"/>
+      <w:numFmt w:val="decimal"/>
+      <w:lvlText w:val="%1.%2.%3.%4.%5.%6.%7."/>
+      <w:lvlJc w:val="left"/>
+      <w:pPr>
+        <w:ind w:left="3240" w:hanging="1080"/>
+      </w:pPr>
+    </w:lvl>
+    <w:lvl w:ilvl="7">
+      <w:start w:val="1"/>
+      <w:numFmt w:val="decimal"/>
+      <w:lvlText w:val="%1.%2.%3.%4.%5.%6.%7.%8."/>
+      <w:lvlJc w:val="left"/>
+      <w:pPr>
+        <w:ind w:left="3744" w:hanging="1224"/>
+      </w:pPr>
+    </w:lvl>
+    <w:lvl w:ilvl="8">
+      <w:start w:val="1"/>
+      <w:numFmt w:val="decimal"/>
+      <w:lvlText w:val="%1.%2.%3.%4.%5.%6.%7.%8.%9."/>
+      <w:lvlJc w:val="left"/>
+      <w:pPr>
+        <w:ind w:left="4320" w:hanging="1440"/>
+      </w:pPr>
+    </w:lvl>
+  </w:abstractNum>
+  <w:abstractNum w:abstractNumId="30" w15:restartNumberingAfterBreak="0">
+    <w:nsid w:val="4E474072"/>
+    <w:multiLevelType w:val="hybridMultilevel"/>
+    <w:tmpl w:val="0E4E0F68"/>
+    <w:lvl w:ilvl="0" w:tplc="40090001">
+      <w:start w:val="1"/>
+      <w:numFmt w:val="bullet"/>
+      <w:lvlText w:val=""/>
+      <w:lvlJc w:val="left"/>
+      <w:pPr>
+        <w:ind w:left="720" w:hanging="360"/>
+      </w:pPr>
+      <w:rPr>
+        <w:rFonts w:ascii="Symbol" w:hAnsi="Symbol" w:hint="default"/>
+      </w:rPr>
+    </w:lvl>
+    <w:lvl w:ilvl="1" w:tplc="40090003" w:tentative="1">
+      <w:start w:val="1"/>
+      <w:numFmt w:val="bullet"/>
+      <w:lvlText w:val="o"/>
+      <w:lvlJc w:val="left"/>
+      <w:pPr>
+        <w:ind w:left="1440" w:hanging="360"/>
+      </w:pPr>
+      <w:rPr>
+        <w:rFonts w:ascii="Courier New" w:hAnsi="Courier New" w:cs="Courier New" w:hint="default"/>
+      </w:rPr>
+    </w:lvl>
+    <w:lvl w:ilvl="2" w:tplc="40090005" w:tentative="1">
+      <w:start w:val="1"/>
+      <w:numFmt w:val="bullet"/>
+      <w:lvlText w:val=""/>
+      <w:lvlJc w:val="left"/>
+      <w:pPr>
+        <w:ind w:left="2160" w:hanging="360"/>
+      </w:pPr>
+      <w:rPr>
+        <w:rFonts w:ascii="Wingdings" w:hAnsi="Wingdings" w:hint="default"/>
+      </w:rPr>
+    </w:lvl>
+    <w:lvl w:ilvl="3" w:tplc="40090001" w:tentative="1">
+      <w:start w:val="1"/>
+      <w:numFmt w:val="bullet"/>
+      <w:lvlText w:val=""/>
+      <w:lvlJc w:val="left"/>
+      <w:pPr>
+        <w:ind w:left="2880" w:hanging="360"/>
+      </w:pPr>
+      <w:rPr>
+        <w:rFonts w:ascii="Symbol" w:hAnsi="Symbol" w:hint="default"/>
+      </w:rPr>
+    </w:lvl>
+    <w:lvl w:ilvl="4" w:tplc="40090003" w:tentative="1">
+      <w:start w:val="1"/>
+      <w:numFmt w:val="bullet"/>
+      <w:lvlText w:val="o"/>
+      <w:lvlJc w:val="left"/>
+      <w:pPr>
+        <w:ind w:left="3600" w:hanging="360"/>
+      </w:pPr>
+      <w:rPr>
+        <w:rFonts w:ascii="Courier New" w:hAnsi="Courier New" w:cs="Courier New" w:hint="default"/>
+      </w:rPr>
+    </w:lvl>
+    <w:lvl w:ilvl="5" w:tplc="40090005" w:tentative="1">
+      <w:start w:val="1"/>
+      <w:numFmt w:val="bullet"/>
+      <w:lvlText w:val=""/>
+      <w:lvlJc w:val="left"/>
+      <w:pPr>
+        <w:ind w:left="4320" w:hanging="360"/>
+      </w:pPr>
+      <w:rPr>
+        <w:rFonts w:ascii="Wingdings" w:hAnsi="Wingdings" w:hint="default"/>
+      </w:rPr>
+    </w:lvl>
+    <w:lvl w:ilvl="6" w:tplc="40090001" w:tentative="1">
+      <w:start w:val="1"/>
+      <w:numFmt w:val="bullet"/>
+      <w:lvlText w:val=""/>
+      <w:lvlJc w:val="left"/>
+      <w:pPr>
+        <w:ind w:left="5040" w:hanging="360"/>
+      </w:pPr>
+      <w:rPr>
+        <w:rFonts w:ascii="Symbol" w:hAnsi="Symbol" w:hint="default"/>
+      </w:rPr>
+    </w:lvl>
+    <w:lvl w:ilvl="7" w:tplc="40090003" w:tentative="1">
+      <w:start w:val="1"/>
+      <w:numFmt w:val="bullet"/>
+      <w:lvlText w:val="o"/>
+      <w:lvlJc w:val="left"/>
+      <w:pPr>
+        <w:ind w:left="5760" w:hanging="360"/>
+      </w:pPr>
+      <w:rPr>
+        <w:rFonts w:ascii="Courier New" w:hAnsi="Courier New" w:cs="Courier New" w:hint="default"/>
+      </w:rPr>
+    </w:lvl>
+    <w:lvl w:ilvl="8" w:tplc="40090005" w:tentative="1">
+      <w:start w:val="1"/>
+      <w:numFmt w:val="bullet"/>
+      <w:lvlText w:val=""/>
+      <w:lvlJc w:val="left"/>
+      <w:pPr>
+        <w:ind w:left="6480" w:hanging="360"/>
+      </w:pPr>
+      <w:rPr>
+        <w:rFonts w:ascii="Wingdings" w:hAnsi="Wingdings" w:hint="default"/>
+      </w:rPr>
+    </w:lvl>
+  </w:abstractNum>
+  <w:abstractNum w:abstractNumId="31" w15:restartNumberingAfterBreak="0">
     <w:nsid w:val="4E653C6F"/>
     <w:multiLevelType w:val="hybridMultilevel"/>
     <w:tmpl w:val="684CCAD2"/>
@@ -11032,7 +13115,7 @@
       </w:pPr>
     </w:lvl>
   </w:abstractNum>
-  <w:abstractNum w:abstractNumId="26" w15:restartNumberingAfterBreak="0">
+  <w:abstractNum w:abstractNumId="32" w15:restartNumberingAfterBreak="0">
     <w:nsid w:val="4F773F7C"/>
     <w:multiLevelType w:val="multilevel"/>
     <w:tmpl w:val="AF8650FA"/>
@@ -11127,7 +13210,7 @@
       </w:pPr>
     </w:lvl>
   </w:abstractNum>
-  <w:abstractNum w:abstractNumId="27" w15:restartNumberingAfterBreak="0">
+  <w:abstractNum w:abstractNumId="33" w15:restartNumberingAfterBreak="0">
     <w:nsid w:val="5008003E"/>
     <w:multiLevelType w:val="hybridMultilevel"/>
     <w:tmpl w:val="F08A711E"/>
@@ -11240,7 +13323,7 @@
       </w:rPr>
     </w:lvl>
   </w:abstractNum>
-  <w:abstractNum w:abstractNumId="28" w15:restartNumberingAfterBreak="0">
+  <w:abstractNum w:abstractNumId="34" w15:restartNumberingAfterBreak="0">
     <w:nsid w:val="524E5349"/>
     <w:multiLevelType w:val="hybridMultilevel"/>
     <w:tmpl w:val="DDE05586"/>
@@ -11353,7 +13436,7 @@
       </w:rPr>
     </w:lvl>
   </w:abstractNum>
-  <w:abstractNum w:abstractNumId="29" w15:restartNumberingAfterBreak="0">
+  <w:abstractNum w:abstractNumId="35" w15:restartNumberingAfterBreak="0">
     <w:nsid w:val="59B65F61"/>
     <w:multiLevelType w:val="hybridMultilevel"/>
     <w:tmpl w:val="D2EE8B36"/>
@@ -11466,7 +13549,120 @@
       </w:rPr>
     </w:lvl>
   </w:abstractNum>
-  <w:abstractNum w:abstractNumId="30" w15:restartNumberingAfterBreak="0">
+  <w:abstractNum w:abstractNumId="36" w15:restartNumberingAfterBreak="0">
+    <w:nsid w:val="5A8B5BE2"/>
+    <w:multiLevelType w:val="hybridMultilevel"/>
+    <w:tmpl w:val="5A2E3174"/>
+    <w:lvl w:ilvl="0" w:tplc="40090001">
+      <w:start w:val="1"/>
+      <w:numFmt w:val="bullet"/>
+      <w:lvlText w:val=""/>
+      <w:lvlJc w:val="left"/>
+      <w:pPr>
+        <w:ind w:left="720" w:hanging="360"/>
+      </w:pPr>
+      <w:rPr>
+        <w:rFonts w:ascii="Symbol" w:hAnsi="Symbol" w:hint="default"/>
+      </w:rPr>
+    </w:lvl>
+    <w:lvl w:ilvl="1" w:tplc="40090003" w:tentative="1">
+      <w:start w:val="1"/>
+      <w:numFmt w:val="bullet"/>
+      <w:lvlText w:val="o"/>
+      <w:lvlJc w:val="left"/>
+      <w:pPr>
+        <w:ind w:left="1440" w:hanging="360"/>
+      </w:pPr>
+      <w:rPr>
+        <w:rFonts w:ascii="Courier New" w:hAnsi="Courier New" w:cs="Courier New" w:hint="default"/>
+      </w:rPr>
+    </w:lvl>
+    <w:lvl w:ilvl="2" w:tplc="40090005" w:tentative="1">
+      <w:start w:val="1"/>
+      <w:numFmt w:val="bullet"/>
+      <w:lvlText w:val=""/>
+      <w:lvlJc w:val="left"/>
+      <w:pPr>
+        <w:ind w:left="2160" w:hanging="360"/>
+      </w:pPr>
+      <w:rPr>
+        <w:rFonts w:ascii="Wingdings" w:hAnsi="Wingdings" w:hint="default"/>
+      </w:rPr>
+    </w:lvl>
+    <w:lvl w:ilvl="3" w:tplc="40090001" w:tentative="1">
+      <w:start w:val="1"/>
+      <w:numFmt w:val="bullet"/>
+      <w:lvlText w:val=""/>
+      <w:lvlJc w:val="left"/>
+      <w:pPr>
+        <w:ind w:left="2880" w:hanging="360"/>
+      </w:pPr>
+      <w:rPr>
+        <w:rFonts w:ascii="Symbol" w:hAnsi="Symbol" w:hint="default"/>
+      </w:rPr>
+    </w:lvl>
+    <w:lvl w:ilvl="4" w:tplc="40090003" w:tentative="1">
+      <w:start w:val="1"/>
+      <w:numFmt w:val="bullet"/>
+      <w:lvlText w:val="o"/>
+      <w:lvlJc w:val="left"/>
+      <w:pPr>
+        <w:ind w:left="3600" w:hanging="360"/>
+      </w:pPr>
+      <w:rPr>
+        <w:rFonts w:ascii="Courier New" w:hAnsi="Courier New" w:cs="Courier New" w:hint="default"/>
+      </w:rPr>
+    </w:lvl>
+    <w:lvl w:ilvl="5" w:tplc="40090005" w:tentative="1">
+      <w:start w:val="1"/>
+      <w:numFmt w:val="bullet"/>
+      <w:lvlText w:val=""/>
+      <w:lvlJc w:val="left"/>
+      <w:pPr>
+        <w:ind w:left="4320" w:hanging="360"/>
+      </w:pPr>
+      <w:rPr>
+        <w:rFonts w:ascii="Wingdings" w:hAnsi="Wingdings" w:hint="default"/>
+      </w:rPr>
+    </w:lvl>
+    <w:lvl w:ilvl="6" w:tplc="40090001" w:tentative="1">
+      <w:start w:val="1"/>
+      <w:numFmt w:val="bullet"/>
+      <w:lvlText w:val=""/>
+      <w:lvlJc w:val="left"/>
+      <w:pPr>
+        <w:ind w:left="5040" w:hanging="360"/>
+      </w:pPr>
+      <w:rPr>
+        <w:rFonts w:ascii="Symbol" w:hAnsi="Symbol" w:hint="default"/>
+      </w:rPr>
+    </w:lvl>
+    <w:lvl w:ilvl="7" w:tplc="40090003" w:tentative="1">
+      <w:start w:val="1"/>
+      <w:numFmt w:val="bullet"/>
+      <w:lvlText w:val="o"/>
+      <w:lvlJc w:val="left"/>
+      <w:pPr>
+        <w:ind w:left="5760" w:hanging="360"/>
+      </w:pPr>
+      <w:rPr>
+        <w:rFonts w:ascii="Courier New" w:hAnsi="Courier New" w:cs="Courier New" w:hint="default"/>
+      </w:rPr>
+    </w:lvl>
+    <w:lvl w:ilvl="8" w:tplc="40090005" w:tentative="1">
+      <w:start w:val="1"/>
+      <w:numFmt w:val="bullet"/>
+      <w:lvlText w:val=""/>
+      <w:lvlJc w:val="left"/>
+      <w:pPr>
+        <w:ind w:left="6480" w:hanging="360"/>
+      </w:pPr>
+      <w:rPr>
+        <w:rFonts w:ascii="Wingdings" w:hAnsi="Wingdings" w:hint="default"/>
+      </w:rPr>
+    </w:lvl>
+  </w:abstractNum>
+  <w:abstractNum w:abstractNumId="37" w15:restartNumberingAfterBreak="0">
     <w:nsid w:val="5B5171F8"/>
     <w:multiLevelType w:val="hybridMultilevel"/>
     <w:tmpl w:val="EACC3F76"/>
@@ -11579,7 +13775,7 @@
       </w:rPr>
     </w:lvl>
   </w:abstractNum>
-  <w:abstractNum w:abstractNumId="31" w15:restartNumberingAfterBreak="0">
+  <w:abstractNum w:abstractNumId="38" w15:restartNumberingAfterBreak="0">
     <w:nsid w:val="5B7F52C3"/>
     <w:multiLevelType w:val="multilevel"/>
     <w:tmpl w:val="AF8650FA"/>
@@ -11674,7 +13870,120 @@
       </w:pPr>
     </w:lvl>
   </w:abstractNum>
-  <w:abstractNum w:abstractNumId="32" w15:restartNumberingAfterBreak="0">
+  <w:abstractNum w:abstractNumId="39" w15:restartNumberingAfterBreak="0">
+    <w:nsid w:val="5CC54074"/>
+    <w:multiLevelType w:val="hybridMultilevel"/>
+    <w:tmpl w:val="A6C67F26"/>
+    <w:lvl w:ilvl="0" w:tplc="40090001">
+      <w:start w:val="1"/>
+      <w:numFmt w:val="bullet"/>
+      <w:lvlText w:val=""/>
+      <w:lvlJc w:val="left"/>
+      <w:pPr>
+        <w:ind w:left="720" w:hanging="360"/>
+      </w:pPr>
+      <w:rPr>
+        <w:rFonts w:ascii="Symbol" w:hAnsi="Symbol" w:hint="default"/>
+      </w:rPr>
+    </w:lvl>
+    <w:lvl w:ilvl="1" w:tplc="40090003" w:tentative="1">
+      <w:start w:val="1"/>
+      <w:numFmt w:val="bullet"/>
+      <w:lvlText w:val="o"/>
+      <w:lvlJc w:val="left"/>
+      <w:pPr>
+        <w:ind w:left="1440" w:hanging="360"/>
+      </w:pPr>
+      <w:rPr>
+        <w:rFonts w:ascii="Courier New" w:hAnsi="Courier New" w:cs="Courier New" w:hint="default"/>
+      </w:rPr>
+    </w:lvl>
+    <w:lvl w:ilvl="2" w:tplc="40090005" w:tentative="1">
+      <w:start w:val="1"/>
+      <w:numFmt w:val="bullet"/>
+      <w:lvlText w:val=""/>
+      <w:lvlJc w:val="left"/>
+      <w:pPr>
+        <w:ind w:left="2160" w:hanging="360"/>
+      </w:pPr>
+      <w:rPr>
+        <w:rFonts w:ascii="Wingdings" w:hAnsi="Wingdings" w:hint="default"/>
+      </w:rPr>
+    </w:lvl>
+    <w:lvl w:ilvl="3" w:tplc="40090001" w:tentative="1">
+      <w:start w:val="1"/>
+      <w:numFmt w:val="bullet"/>
+      <w:lvlText w:val=""/>
+      <w:lvlJc w:val="left"/>
+      <w:pPr>
+        <w:ind w:left="2880" w:hanging="360"/>
+      </w:pPr>
+      <w:rPr>
+        <w:rFonts w:ascii="Symbol" w:hAnsi="Symbol" w:hint="default"/>
+      </w:rPr>
+    </w:lvl>
+    <w:lvl w:ilvl="4" w:tplc="40090003" w:tentative="1">
+      <w:start w:val="1"/>
+      <w:numFmt w:val="bullet"/>
+      <w:lvlText w:val="o"/>
+      <w:lvlJc w:val="left"/>
+      <w:pPr>
+        <w:ind w:left="3600" w:hanging="360"/>
+      </w:pPr>
+      <w:rPr>
+        <w:rFonts w:ascii="Courier New" w:hAnsi="Courier New" w:cs="Courier New" w:hint="default"/>
+      </w:rPr>
+    </w:lvl>
+    <w:lvl w:ilvl="5" w:tplc="40090005" w:tentative="1">
+      <w:start w:val="1"/>
+      <w:numFmt w:val="bullet"/>
+      <w:lvlText w:val=""/>
+      <w:lvlJc w:val="left"/>
+      <w:pPr>
+        <w:ind w:left="4320" w:hanging="360"/>
+      </w:pPr>
+      <w:rPr>
+        <w:rFonts w:ascii="Wingdings" w:hAnsi="Wingdings" w:hint="default"/>
+      </w:rPr>
+    </w:lvl>
+    <w:lvl w:ilvl="6" w:tplc="40090001" w:tentative="1">
+      <w:start w:val="1"/>
+      <w:numFmt w:val="bullet"/>
+      <w:lvlText w:val=""/>
+      <w:lvlJc w:val="left"/>
+      <w:pPr>
+        <w:ind w:left="5040" w:hanging="360"/>
+      </w:pPr>
+      <w:rPr>
+        <w:rFonts w:ascii="Symbol" w:hAnsi="Symbol" w:hint="default"/>
+      </w:rPr>
+    </w:lvl>
+    <w:lvl w:ilvl="7" w:tplc="40090003" w:tentative="1">
+      <w:start w:val="1"/>
+      <w:numFmt w:val="bullet"/>
+      <w:lvlText w:val="o"/>
+      <w:lvlJc w:val="left"/>
+      <w:pPr>
+        <w:ind w:left="5760" w:hanging="360"/>
+      </w:pPr>
+      <w:rPr>
+        <w:rFonts w:ascii="Courier New" w:hAnsi="Courier New" w:cs="Courier New" w:hint="default"/>
+      </w:rPr>
+    </w:lvl>
+    <w:lvl w:ilvl="8" w:tplc="40090005" w:tentative="1">
+      <w:start w:val="1"/>
+      <w:numFmt w:val="bullet"/>
+      <w:lvlText w:val=""/>
+      <w:lvlJc w:val="left"/>
+      <w:pPr>
+        <w:ind w:left="6480" w:hanging="360"/>
+      </w:pPr>
+      <w:rPr>
+        <w:rFonts w:ascii="Wingdings" w:hAnsi="Wingdings" w:hint="default"/>
+      </w:rPr>
+    </w:lvl>
+  </w:abstractNum>
+  <w:abstractNum w:abstractNumId="40" w15:restartNumberingAfterBreak="0">
     <w:nsid w:val="5CD1145F"/>
     <w:multiLevelType w:val="multilevel"/>
     <w:tmpl w:val="89863FC2"/>
@@ -11787,7 +14096,7 @@
       </w:rPr>
     </w:lvl>
   </w:abstractNum>
-  <w:abstractNum w:abstractNumId="33" w15:restartNumberingAfterBreak="0">
+  <w:abstractNum w:abstractNumId="41" w15:restartNumberingAfterBreak="0">
     <w:nsid w:val="5D8D31EE"/>
     <w:multiLevelType w:val="multilevel"/>
     <w:tmpl w:val="4009001F"/>
@@ -11873,7 +14182,7 @@
       </w:pPr>
     </w:lvl>
   </w:abstractNum>
-  <w:abstractNum w:abstractNumId="34" w15:restartNumberingAfterBreak="0">
+  <w:abstractNum w:abstractNumId="42" w15:restartNumberingAfterBreak="0">
     <w:nsid w:val="5FB72E17"/>
     <w:multiLevelType w:val="multilevel"/>
     <w:tmpl w:val="715AECBA"/>
@@ -11994,7 +14303,120 @@
       </w:rPr>
     </w:lvl>
   </w:abstractNum>
-  <w:abstractNum w:abstractNumId="35" w15:restartNumberingAfterBreak="0">
+  <w:abstractNum w:abstractNumId="43" w15:restartNumberingAfterBreak="0">
+    <w:nsid w:val="5FF470BA"/>
+    <w:multiLevelType w:val="hybridMultilevel"/>
+    <w:tmpl w:val="A53ED08A"/>
+    <w:lvl w:ilvl="0" w:tplc="40090001">
+      <w:start w:val="1"/>
+      <w:numFmt w:val="bullet"/>
+      <w:lvlText w:val=""/>
+      <w:lvlJc w:val="left"/>
+      <w:pPr>
+        <w:ind w:left="720" w:hanging="360"/>
+      </w:pPr>
+      <w:rPr>
+        <w:rFonts w:ascii="Symbol" w:hAnsi="Symbol" w:hint="default"/>
+      </w:rPr>
+    </w:lvl>
+    <w:lvl w:ilvl="1" w:tplc="40090003" w:tentative="1">
+      <w:start w:val="1"/>
+      <w:numFmt w:val="bullet"/>
+      <w:lvlText w:val="o"/>
+      <w:lvlJc w:val="left"/>
+      <w:pPr>
+        <w:ind w:left="1440" w:hanging="360"/>
+      </w:pPr>
+      <w:rPr>
+        <w:rFonts w:ascii="Courier New" w:hAnsi="Courier New" w:cs="Courier New" w:hint="default"/>
+      </w:rPr>
+    </w:lvl>
+    <w:lvl w:ilvl="2" w:tplc="40090005" w:tentative="1">
+      <w:start w:val="1"/>
+      <w:numFmt w:val="bullet"/>
+      <w:lvlText w:val=""/>
+      <w:lvlJc w:val="left"/>
+      <w:pPr>
+        <w:ind w:left="2160" w:hanging="360"/>
+      </w:pPr>
+      <w:rPr>
+        <w:rFonts w:ascii="Wingdings" w:hAnsi="Wingdings" w:hint="default"/>
+      </w:rPr>
+    </w:lvl>
+    <w:lvl w:ilvl="3" w:tplc="40090001" w:tentative="1">
+      <w:start w:val="1"/>
+      <w:numFmt w:val="bullet"/>
+      <w:lvlText w:val=""/>
+      <w:lvlJc w:val="left"/>
+      <w:pPr>
+        <w:ind w:left="2880" w:hanging="360"/>
+      </w:pPr>
+      <w:rPr>
+        <w:rFonts w:ascii="Symbol" w:hAnsi="Symbol" w:hint="default"/>
+      </w:rPr>
+    </w:lvl>
+    <w:lvl w:ilvl="4" w:tplc="40090003" w:tentative="1">
+      <w:start w:val="1"/>
+      <w:numFmt w:val="bullet"/>
+      <w:lvlText w:val="o"/>
+      <w:lvlJc w:val="left"/>
+      <w:pPr>
+        <w:ind w:left="3600" w:hanging="360"/>
+      </w:pPr>
+      <w:rPr>
+        <w:rFonts w:ascii="Courier New" w:hAnsi="Courier New" w:cs="Courier New" w:hint="default"/>
+      </w:rPr>
+    </w:lvl>
+    <w:lvl w:ilvl="5" w:tplc="40090005" w:tentative="1">
+      <w:start w:val="1"/>
+      <w:numFmt w:val="bullet"/>
+      <w:lvlText w:val=""/>
+      <w:lvlJc w:val="left"/>
+      <w:pPr>
+        <w:ind w:left="4320" w:hanging="360"/>
+      </w:pPr>
+      <w:rPr>
+        <w:rFonts w:ascii="Wingdings" w:hAnsi="Wingdings" w:hint="default"/>
+      </w:rPr>
+    </w:lvl>
+    <w:lvl w:ilvl="6" w:tplc="40090001" w:tentative="1">
+      <w:start w:val="1"/>
+      <w:numFmt w:val="bullet"/>
+      <w:lvlText w:val=""/>
+      <w:lvlJc w:val="left"/>
+      <w:pPr>
+        <w:ind w:left="5040" w:hanging="360"/>
+      </w:pPr>
+      <w:rPr>
+        <w:rFonts w:ascii="Symbol" w:hAnsi="Symbol" w:hint="default"/>
+      </w:rPr>
+    </w:lvl>
+    <w:lvl w:ilvl="7" w:tplc="40090003" w:tentative="1">
+      <w:start w:val="1"/>
+      <w:numFmt w:val="bullet"/>
+      <w:lvlText w:val="o"/>
+      <w:lvlJc w:val="left"/>
+      <w:pPr>
+        <w:ind w:left="5760" w:hanging="360"/>
+      </w:pPr>
+      <w:rPr>
+        <w:rFonts w:ascii="Courier New" w:hAnsi="Courier New" w:cs="Courier New" w:hint="default"/>
+      </w:rPr>
+    </w:lvl>
+    <w:lvl w:ilvl="8" w:tplc="40090005" w:tentative="1">
+      <w:start w:val="1"/>
+      <w:numFmt w:val="bullet"/>
+      <w:lvlText w:val=""/>
+      <w:lvlJc w:val="left"/>
+      <w:pPr>
+        <w:ind w:left="6480" w:hanging="360"/>
+      </w:pPr>
+      <w:rPr>
+        <w:rFonts w:ascii="Wingdings" w:hAnsi="Wingdings" w:hint="default"/>
+      </w:rPr>
+    </w:lvl>
+  </w:abstractNum>
+  <w:abstractNum w:abstractNumId="44" w15:restartNumberingAfterBreak="0">
     <w:nsid w:val="607E1B11"/>
     <w:multiLevelType w:val="multilevel"/>
     <w:tmpl w:val="1B46C0C0"/>
@@ -12089,7 +14511,120 @@
       </w:pPr>
     </w:lvl>
   </w:abstractNum>
-  <w:abstractNum w:abstractNumId="36" w15:restartNumberingAfterBreak="0">
+  <w:abstractNum w:abstractNumId="45" w15:restartNumberingAfterBreak="0">
+    <w:nsid w:val="62A232E4"/>
+    <w:multiLevelType w:val="hybridMultilevel"/>
+    <w:tmpl w:val="3F96E996"/>
+    <w:lvl w:ilvl="0" w:tplc="40090001">
+      <w:start w:val="1"/>
+      <w:numFmt w:val="bullet"/>
+      <w:lvlText w:val=""/>
+      <w:lvlJc w:val="left"/>
+      <w:pPr>
+        <w:ind w:left="720" w:hanging="360"/>
+      </w:pPr>
+      <w:rPr>
+        <w:rFonts w:ascii="Symbol" w:hAnsi="Symbol" w:hint="default"/>
+      </w:rPr>
+    </w:lvl>
+    <w:lvl w:ilvl="1" w:tplc="40090003" w:tentative="1">
+      <w:start w:val="1"/>
+      <w:numFmt w:val="bullet"/>
+      <w:lvlText w:val="o"/>
+      <w:lvlJc w:val="left"/>
+      <w:pPr>
+        <w:ind w:left="1440" w:hanging="360"/>
+      </w:pPr>
+      <w:rPr>
+        <w:rFonts w:ascii="Courier New" w:hAnsi="Courier New" w:cs="Courier New" w:hint="default"/>
+      </w:rPr>
+    </w:lvl>
+    <w:lvl w:ilvl="2" w:tplc="40090005" w:tentative="1">
+      <w:start w:val="1"/>
+      <w:numFmt w:val="bullet"/>
+      <w:lvlText w:val=""/>
+      <w:lvlJc w:val="left"/>
+      <w:pPr>
+        <w:ind w:left="2160" w:hanging="360"/>
+      </w:pPr>
+      <w:rPr>
+        <w:rFonts w:ascii="Wingdings" w:hAnsi="Wingdings" w:hint="default"/>
+      </w:rPr>
+    </w:lvl>
+    <w:lvl w:ilvl="3" w:tplc="40090001" w:tentative="1">
+      <w:start w:val="1"/>
+      <w:numFmt w:val="bullet"/>
+      <w:lvlText w:val=""/>
+      <w:lvlJc w:val="left"/>
+      <w:pPr>
+        <w:ind w:left="2880" w:hanging="360"/>
+      </w:pPr>
+      <w:rPr>
+        <w:rFonts w:ascii="Symbol" w:hAnsi="Symbol" w:hint="default"/>
+      </w:rPr>
+    </w:lvl>
+    <w:lvl w:ilvl="4" w:tplc="40090003" w:tentative="1">
+      <w:start w:val="1"/>
+      <w:numFmt w:val="bullet"/>
+      <w:lvlText w:val="o"/>
+      <w:lvlJc w:val="left"/>
+      <w:pPr>
+        <w:ind w:left="3600" w:hanging="360"/>
+      </w:pPr>
+      <w:rPr>
+        <w:rFonts w:ascii="Courier New" w:hAnsi="Courier New" w:cs="Courier New" w:hint="default"/>
+      </w:rPr>
+    </w:lvl>
+    <w:lvl w:ilvl="5" w:tplc="40090005" w:tentative="1">
+      <w:start w:val="1"/>
+      <w:numFmt w:val="bullet"/>
+      <w:lvlText w:val=""/>
+      <w:lvlJc w:val="left"/>
+      <w:pPr>
+        <w:ind w:left="4320" w:hanging="360"/>
+      </w:pPr>
+      <w:rPr>
+        <w:rFonts w:ascii="Wingdings" w:hAnsi="Wingdings" w:hint="default"/>
+      </w:rPr>
+    </w:lvl>
+    <w:lvl w:ilvl="6" w:tplc="40090001" w:tentative="1">
+      <w:start w:val="1"/>
+      <w:numFmt w:val="bullet"/>
+      <w:lvlText w:val=""/>
+      <w:lvlJc w:val="left"/>
+      <w:pPr>
+        <w:ind w:left="5040" w:hanging="360"/>
+      </w:pPr>
+      <w:rPr>
+        <w:rFonts w:ascii="Symbol" w:hAnsi="Symbol" w:hint="default"/>
+      </w:rPr>
+    </w:lvl>
+    <w:lvl w:ilvl="7" w:tplc="40090003" w:tentative="1">
+      <w:start w:val="1"/>
+      <w:numFmt w:val="bullet"/>
+      <w:lvlText w:val="o"/>
+      <w:lvlJc w:val="left"/>
+      <w:pPr>
+        <w:ind w:left="5760" w:hanging="360"/>
+      </w:pPr>
+      <w:rPr>
+        <w:rFonts w:ascii="Courier New" w:hAnsi="Courier New" w:cs="Courier New" w:hint="default"/>
+      </w:rPr>
+    </w:lvl>
+    <w:lvl w:ilvl="8" w:tplc="40090005" w:tentative="1">
+      <w:start w:val="1"/>
+      <w:numFmt w:val="bullet"/>
+      <w:lvlText w:val=""/>
+      <w:lvlJc w:val="left"/>
+      <w:pPr>
+        <w:ind w:left="6480" w:hanging="360"/>
+      </w:pPr>
+      <w:rPr>
+        <w:rFonts w:ascii="Wingdings" w:hAnsi="Wingdings" w:hint="default"/>
+      </w:rPr>
+    </w:lvl>
+  </w:abstractNum>
+  <w:abstractNum w:abstractNumId="46" w15:restartNumberingAfterBreak="0">
     <w:nsid w:val="637F4387"/>
     <w:multiLevelType w:val="multilevel"/>
     <w:tmpl w:val="A43E5F90"/>
@@ -12178,7 +14713,7 @@
       </w:pPr>
     </w:lvl>
   </w:abstractNum>
-  <w:abstractNum w:abstractNumId="37" w15:restartNumberingAfterBreak="0">
+  <w:abstractNum w:abstractNumId="47" w15:restartNumberingAfterBreak="0">
     <w:nsid w:val="641950CC"/>
     <w:multiLevelType w:val="multilevel"/>
     <w:tmpl w:val="AF8650FA"/>
@@ -12273,7 +14808,7 @@
       </w:pPr>
     </w:lvl>
   </w:abstractNum>
-  <w:abstractNum w:abstractNumId="38" w15:restartNumberingAfterBreak="0">
+  <w:abstractNum w:abstractNumId="48" w15:restartNumberingAfterBreak="0">
     <w:nsid w:val="64BF34A3"/>
     <w:multiLevelType w:val="multilevel"/>
     <w:tmpl w:val="72DC0442"/>
@@ -12365,7 +14900,120 @@
       </w:pPr>
     </w:lvl>
   </w:abstractNum>
-  <w:abstractNum w:abstractNumId="39" w15:restartNumberingAfterBreak="0">
+  <w:abstractNum w:abstractNumId="49" w15:restartNumberingAfterBreak="0">
+    <w:nsid w:val="65165AE0"/>
+    <w:multiLevelType w:val="hybridMultilevel"/>
+    <w:tmpl w:val="35A697F6"/>
+    <w:lvl w:ilvl="0" w:tplc="40090001">
+      <w:start w:val="1"/>
+      <w:numFmt w:val="bullet"/>
+      <w:lvlText w:val=""/>
+      <w:lvlJc w:val="left"/>
+      <w:pPr>
+        <w:ind w:left="720" w:hanging="360"/>
+      </w:pPr>
+      <w:rPr>
+        <w:rFonts w:ascii="Symbol" w:hAnsi="Symbol" w:hint="default"/>
+      </w:rPr>
+    </w:lvl>
+    <w:lvl w:ilvl="1" w:tplc="40090003" w:tentative="1">
+      <w:start w:val="1"/>
+      <w:numFmt w:val="bullet"/>
+      <w:lvlText w:val="o"/>
+      <w:lvlJc w:val="left"/>
+      <w:pPr>
+        <w:ind w:left="1440" w:hanging="360"/>
+      </w:pPr>
+      <w:rPr>
+        <w:rFonts w:ascii="Courier New" w:hAnsi="Courier New" w:cs="Courier New" w:hint="default"/>
+      </w:rPr>
+    </w:lvl>
+    <w:lvl w:ilvl="2" w:tplc="40090005" w:tentative="1">
+      <w:start w:val="1"/>
+      <w:numFmt w:val="bullet"/>
+      <w:lvlText w:val=""/>
+      <w:lvlJc w:val="left"/>
+      <w:pPr>
+        <w:ind w:left="2160" w:hanging="360"/>
+      </w:pPr>
+      <w:rPr>
+        <w:rFonts w:ascii="Wingdings" w:hAnsi="Wingdings" w:hint="default"/>
+      </w:rPr>
+    </w:lvl>
+    <w:lvl w:ilvl="3" w:tplc="40090001" w:tentative="1">
+      <w:start w:val="1"/>
+      <w:numFmt w:val="bullet"/>
+      <w:lvlText w:val=""/>
+      <w:lvlJc w:val="left"/>
+      <w:pPr>
+        <w:ind w:left="2880" w:hanging="360"/>
+      </w:pPr>
+      <w:rPr>
+        <w:rFonts w:ascii="Symbol" w:hAnsi="Symbol" w:hint="default"/>
+      </w:rPr>
+    </w:lvl>
+    <w:lvl w:ilvl="4" w:tplc="40090003" w:tentative="1">
+      <w:start w:val="1"/>
+      <w:numFmt w:val="bullet"/>
+      <w:lvlText w:val="o"/>
+      <w:lvlJc w:val="left"/>
+      <w:pPr>
+        <w:ind w:left="3600" w:hanging="360"/>
+      </w:pPr>
+      <w:rPr>
+        <w:rFonts w:ascii="Courier New" w:hAnsi="Courier New" w:cs="Courier New" w:hint="default"/>
+      </w:rPr>
+    </w:lvl>
+    <w:lvl w:ilvl="5" w:tplc="40090005" w:tentative="1">
+      <w:start w:val="1"/>
+      <w:numFmt w:val="bullet"/>
+      <w:lvlText w:val=""/>
+      <w:lvlJc w:val="left"/>
+      <w:pPr>
+        <w:ind w:left="4320" w:hanging="360"/>
+      </w:pPr>
+      <w:rPr>
+        <w:rFonts w:ascii="Wingdings" w:hAnsi="Wingdings" w:hint="default"/>
+      </w:rPr>
+    </w:lvl>
+    <w:lvl w:ilvl="6" w:tplc="40090001" w:tentative="1">
+      <w:start w:val="1"/>
+      <w:numFmt w:val="bullet"/>
+      <w:lvlText w:val=""/>
+      <w:lvlJc w:val="left"/>
+      <w:pPr>
+        <w:ind w:left="5040" w:hanging="360"/>
+      </w:pPr>
+      <w:rPr>
+        <w:rFonts w:ascii="Symbol" w:hAnsi="Symbol" w:hint="default"/>
+      </w:rPr>
+    </w:lvl>
+    <w:lvl w:ilvl="7" w:tplc="40090003" w:tentative="1">
+      <w:start w:val="1"/>
+      <w:numFmt w:val="bullet"/>
+      <w:lvlText w:val="o"/>
+      <w:lvlJc w:val="left"/>
+      <w:pPr>
+        <w:ind w:left="5760" w:hanging="360"/>
+      </w:pPr>
+      <w:rPr>
+        <w:rFonts w:ascii="Courier New" w:hAnsi="Courier New" w:cs="Courier New" w:hint="default"/>
+      </w:rPr>
+    </w:lvl>
+    <w:lvl w:ilvl="8" w:tplc="40090005" w:tentative="1">
+      <w:start w:val="1"/>
+      <w:numFmt w:val="bullet"/>
+      <w:lvlText w:val=""/>
+      <w:lvlJc w:val="left"/>
+      <w:pPr>
+        <w:ind w:left="6480" w:hanging="360"/>
+      </w:pPr>
+      <w:rPr>
+        <w:rFonts w:ascii="Wingdings" w:hAnsi="Wingdings" w:hint="default"/>
+      </w:rPr>
+    </w:lvl>
+  </w:abstractNum>
+  <w:abstractNum w:abstractNumId="50" w15:restartNumberingAfterBreak="0">
     <w:nsid w:val="658F74DA"/>
     <w:multiLevelType w:val="hybridMultilevel"/>
     <w:tmpl w:val="41164B2A"/>
@@ -12478,7 +15126,7 @@
       </w:rPr>
     </w:lvl>
   </w:abstractNum>
-  <w:abstractNum w:abstractNumId="40" w15:restartNumberingAfterBreak="0">
+  <w:abstractNum w:abstractNumId="51" w15:restartNumberingAfterBreak="0">
     <w:nsid w:val="663C631A"/>
     <w:multiLevelType w:val="multilevel"/>
     <w:tmpl w:val="72DC0442"/>
@@ -12570,7 +15218,7 @@
       </w:pPr>
     </w:lvl>
   </w:abstractNum>
-  <w:abstractNum w:abstractNumId="41" w15:restartNumberingAfterBreak="0">
+  <w:abstractNum w:abstractNumId="52" w15:restartNumberingAfterBreak="0">
     <w:nsid w:val="68D625CE"/>
     <w:multiLevelType w:val="hybridMultilevel"/>
     <w:tmpl w:val="208E39DE"/>
@@ -12683,7 +15331,7 @@
       </w:rPr>
     </w:lvl>
   </w:abstractNum>
-  <w:abstractNum w:abstractNumId="42" w15:restartNumberingAfterBreak="0">
+  <w:abstractNum w:abstractNumId="53" w15:restartNumberingAfterBreak="0">
     <w:nsid w:val="693737E4"/>
     <w:multiLevelType w:val="multilevel"/>
     <w:tmpl w:val="9E4663FC"/>
@@ -12778,7 +15426,7 @@
       </w:pPr>
     </w:lvl>
   </w:abstractNum>
-  <w:abstractNum w:abstractNumId="43" w15:restartNumberingAfterBreak="0">
+  <w:abstractNum w:abstractNumId="54" w15:restartNumberingAfterBreak="0">
     <w:nsid w:val="6DDB315B"/>
     <w:multiLevelType w:val="multilevel"/>
     <w:tmpl w:val="9506B2A6"/>
@@ -12867,7 +15515,7 @@
       </w:pPr>
     </w:lvl>
   </w:abstractNum>
-  <w:abstractNum w:abstractNumId="44" w15:restartNumberingAfterBreak="0">
+  <w:abstractNum w:abstractNumId="55" w15:restartNumberingAfterBreak="0">
     <w:nsid w:val="6FEC1125"/>
     <w:multiLevelType w:val="multilevel"/>
     <w:tmpl w:val="4B603932"/>
@@ -12980,7 +15628,7 @@
       </w:rPr>
     </w:lvl>
   </w:abstractNum>
-  <w:abstractNum w:abstractNumId="45" w15:restartNumberingAfterBreak="0">
+  <w:abstractNum w:abstractNumId="56" w15:restartNumberingAfterBreak="0">
     <w:nsid w:val="723C36D8"/>
     <w:multiLevelType w:val="hybridMultilevel"/>
     <w:tmpl w:val="5DE44D48"/>
@@ -13093,7 +15741,7 @@
       </w:rPr>
     </w:lvl>
   </w:abstractNum>
-  <w:abstractNum w:abstractNumId="46" w15:restartNumberingAfterBreak="0">
+  <w:abstractNum w:abstractNumId="57" w15:restartNumberingAfterBreak="0">
     <w:nsid w:val="77A82909"/>
     <w:multiLevelType w:val="multilevel"/>
     <w:tmpl w:val="AF8650FA"/>
@@ -13188,7 +15836,7 @@
       </w:pPr>
     </w:lvl>
   </w:abstractNum>
-  <w:abstractNum w:abstractNumId="47" w15:restartNumberingAfterBreak="0">
+  <w:abstractNum w:abstractNumId="58" w15:restartNumberingAfterBreak="0">
     <w:nsid w:val="7A542B0A"/>
     <w:multiLevelType w:val="multilevel"/>
     <w:tmpl w:val="9506B2A6"/>
@@ -13277,7 +15925,7 @@
       </w:pPr>
     </w:lvl>
   </w:abstractNum>
-  <w:abstractNum w:abstractNumId="48" w15:restartNumberingAfterBreak="0">
+  <w:abstractNum w:abstractNumId="59" w15:restartNumberingAfterBreak="0">
     <w:nsid w:val="7B956710"/>
     <w:multiLevelType w:val="multilevel"/>
     <w:tmpl w:val="25C2D402"/>
@@ -13369,7 +16017,120 @@
       </w:pPr>
     </w:lvl>
   </w:abstractNum>
-  <w:abstractNum w:abstractNumId="49" w15:restartNumberingAfterBreak="0">
+  <w:abstractNum w:abstractNumId="60" w15:restartNumberingAfterBreak="0">
+    <w:nsid w:val="7C89562A"/>
+    <w:multiLevelType w:val="hybridMultilevel"/>
+    <w:tmpl w:val="C3F65CA4"/>
+    <w:lvl w:ilvl="0" w:tplc="40090001">
+      <w:start w:val="1"/>
+      <w:numFmt w:val="bullet"/>
+      <w:lvlText w:val=""/>
+      <w:lvlJc w:val="left"/>
+      <w:pPr>
+        <w:ind w:left="720" w:hanging="360"/>
+      </w:pPr>
+      <w:rPr>
+        <w:rFonts w:ascii="Symbol" w:hAnsi="Symbol" w:hint="default"/>
+      </w:rPr>
+    </w:lvl>
+    <w:lvl w:ilvl="1" w:tplc="40090003" w:tentative="1">
+      <w:start w:val="1"/>
+      <w:numFmt w:val="bullet"/>
+      <w:lvlText w:val="o"/>
+      <w:lvlJc w:val="left"/>
+      <w:pPr>
+        <w:ind w:left="1440" w:hanging="360"/>
+      </w:pPr>
+      <w:rPr>
+        <w:rFonts w:ascii="Courier New" w:hAnsi="Courier New" w:cs="Courier New" w:hint="default"/>
+      </w:rPr>
+    </w:lvl>
+    <w:lvl w:ilvl="2" w:tplc="40090005" w:tentative="1">
+      <w:start w:val="1"/>
+      <w:numFmt w:val="bullet"/>
+      <w:lvlText w:val=""/>
+      <w:lvlJc w:val="left"/>
+      <w:pPr>
+        <w:ind w:left="2160" w:hanging="360"/>
+      </w:pPr>
+      <w:rPr>
+        <w:rFonts w:ascii="Wingdings" w:hAnsi="Wingdings" w:hint="default"/>
+      </w:rPr>
+    </w:lvl>
+    <w:lvl w:ilvl="3" w:tplc="40090001" w:tentative="1">
+      <w:start w:val="1"/>
+      <w:numFmt w:val="bullet"/>
+      <w:lvlText w:val=""/>
+      <w:lvlJc w:val="left"/>
+      <w:pPr>
+        <w:ind w:left="2880" w:hanging="360"/>
+      </w:pPr>
+      <w:rPr>
+        <w:rFonts w:ascii="Symbol" w:hAnsi="Symbol" w:hint="default"/>
+      </w:rPr>
+    </w:lvl>
+    <w:lvl w:ilvl="4" w:tplc="40090003" w:tentative="1">
+      <w:start w:val="1"/>
+      <w:numFmt w:val="bullet"/>
+      <w:lvlText w:val="o"/>
+      <w:lvlJc w:val="left"/>
+      <w:pPr>
+        <w:ind w:left="3600" w:hanging="360"/>
+      </w:pPr>
+      <w:rPr>
+        <w:rFonts w:ascii="Courier New" w:hAnsi="Courier New" w:cs="Courier New" w:hint="default"/>
+      </w:rPr>
+    </w:lvl>
+    <w:lvl w:ilvl="5" w:tplc="40090005" w:tentative="1">
+      <w:start w:val="1"/>
+      <w:numFmt w:val="bullet"/>
+      <w:lvlText w:val=""/>
+      <w:lvlJc w:val="left"/>
+      <w:pPr>
+        <w:ind w:left="4320" w:hanging="360"/>
+      </w:pPr>
+      <w:rPr>
+        <w:rFonts w:ascii="Wingdings" w:hAnsi="Wingdings" w:hint="default"/>
+      </w:rPr>
+    </w:lvl>
+    <w:lvl w:ilvl="6" w:tplc="40090001" w:tentative="1">
+      <w:start w:val="1"/>
+      <w:numFmt w:val="bullet"/>
+      <w:lvlText w:val=""/>
+      <w:lvlJc w:val="left"/>
+      <w:pPr>
+        <w:ind w:left="5040" w:hanging="360"/>
+      </w:pPr>
+      <w:rPr>
+        <w:rFonts w:ascii="Symbol" w:hAnsi="Symbol" w:hint="default"/>
+      </w:rPr>
+    </w:lvl>
+    <w:lvl w:ilvl="7" w:tplc="40090003" w:tentative="1">
+      <w:start w:val="1"/>
+      <w:numFmt w:val="bullet"/>
+      <w:lvlText w:val="o"/>
+      <w:lvlJc w:val="left"/>
+      <w:pPr>
+        <w:ind w:left="5760" w:hanging="360"/>
+      </w:pPr>
+      <w:rPr>
+        <w:rFonts w:ascii="Courier New" w:hAnsi="Courier New" w:cs="Courier New" w:hint="default"/>
+      </w:rPr>
+    </w:lvl>
+    <w:lvl w:ilvl="8" w:tplc="40090005" w:tentative="1">
+      <w:start w:val="1"/>
+      <w:numFmt w:val="bullet"/>
+      <w:lvlText w:val=""/>
+      <w:lvlJc w:val="left"/>
+      <w:pPr>
+        <w:ind w:left="6480" w:hanging="360"/>
+      </w:pPr>
+      <w:rPr>
+        <w:rFonts w:ascii="Wingdings" w:hAnsi="Wingdings" w:hint="default"/>
+      </w:rPr>
+    </w:lvl>
+  </w:abstractNum>
+  <w:abstractNum w:abstractNumId="61" w15:restartNumberingAfterBreak="0">
     <w:nsid w:val="7CB17658"/>
     <w:multiLevelType w:val="hybridMultilevel"/>
     <w:tmpl w:val="1D42DA62"/>
@@ -13482,7 +16243,7 @@
       </w:rPr>
     </w:lvl>
   </w:abstractNum>
-  <w:abstractNum w:abstractNumId="50" w15:restartNumberingAfterBreak="0">
+  <w:abstractNum w:abstractNumId="62" w15:restartNumberingAfterBreak="0">
     <w:nsid w:val="7DA57BE0"/>
     <w:multiLevelType w:val="multilevel"/>
     <w:tmpl w:val="A43E5F90"/>
@@ -13571,7 +16332,7 @@
       </w:pPr>
     </w:lvl>
   </w:abstractNum>
-  <w:abstractNum w:abstractNumId="51" w15:restartNumberingAfterBreak="0">
+  <w:abstractNum w:abstractNumId="63" w15:restartNumberingAfterBreak="0">
     <w:nsid w:val="7EE863F5"/>
     <w:multiLevelType w:val="multilevel"/>
     <w:tmpl w:val="4009001F"/>
@@ -13660,7 +16421,7 @@
       </w:pPr>
     </w:lvl>
   </w:abstractNum>
-  <w:abstractNum w:abstractNumId="52" w15:restartNumberingAfterBreak="0">
+  <w:abstractNum w:abstractNumId="64" w15:restartNumberingAfterBreak="0">
     <w:nsid w:val="7F1F122B"/>
     <w:multiLevelType w:val="multilevel"/>
     <w:tmpl w:val="72DC0442"/>
@@ -13753,61 +16514,61 @@
     </w:lvl>
   </w:abstractNum>
   <w:num w:numId="1" w16cid:durableId="813179379">
+    <w:abstractNumId w:val="18"/>
+  </w:num>
+  <w:num w:numId="2" w16cid:durableId="2140030685">
+    <w:abstractNumId w:val="26"/>
+  </w:num>
+  <w:num w:numId="3" w16cid:durableId="2008245783">
+    <w:abstractNumId w:val="31"/>
+  </w:num>
+  <w:num w:numId="4" w16cid:durableId="540483536">
+    <w:abstractNumId w:val="13"/>
+  </w:num>
+  <w:num w:numId="5" w16cid:durableId="1405027561">
+    <w:abstractNumId w:val="9"/>
+  </w:num>
+  <w:num w:numId="6" w16cid:durableId="28845206">
+    <w:abstractNumId w:val="35"/>
+  </w:num>
+  <w:num w:numId="7" w16cid:durableId="868881396">
+    <w:abstractNumId w:val="14"/>
+  </w:num>
+  <w:num w:numId="8" w16cid:durableId="1775788597">
     <w:abstractNumId w:val="16"/>
   </w:num>
-  <w:num w:numId="2" w16cid:durableId="2140030685">
+  <w:num w:numId="9" w16cid:durableId="735974436">
     <w:abstractNumId w:val="22"/>
   </w:num>
-  <w:num w:numId="3" w16cid:durableId="2008245783">
-    <w:abstractNumId w:val="25"/>
-  </w:num>
-  <w:num w:numId="4" w16cid:durableId="540483536">
-    <w:abstractNumId w:val="12"/>
-  </w:num>
-  <w:num w:numId="5" w16cid:durableId="1405027561">
-    <w:abstractNumId w:val="8"/>
-  </w:num>
-  <w:num w:numId="6" w16cid:durableId="28845206">
-    <w:abstractNumId w:val="29"/>
-  </w:num>
-  <w:num w:numId="7" w16cid:durableId="868881396">
-    <w:abstractNumId w:val="13"/>
-  </w:num>
-  <w:num w:numId="8" w16cid:durableId="1775788597">
-    <w:abstractNumId w:val="14"/>
-  </w:num>
-  <w:num w:numId="9" w16cid:durableId="735974436">
-    <w:abstractNumId w:val="19"/>
-  </w:num>
   <w:num w:numId="10" w16cid:durableId="1470708080">
-    <w:abstractNumId w:val="24"/>
+    <w:abstractNumId w:val="28"/>
   </w:num>
   <w:num w:numId="11" w16cid:durableId="2001807513">
-    <w:abstractNumId w:val="44"/>
+    <w:abstractNumId w:val="55"/>
   </w:num>
   <w:num w:numId="12" w16cid:durableId="1144850617">
-    <w:abstractNumId w:val="32"/>
+    <w:abstractNumId w:val="40"/>
   </w:num>
   <w:num w:numId="13" w16cid:durableId="886180933">
-    <w:abstractNumId w:val="41"/>
+    <w:abstractNumId w:val="52"/>
   </w:num>
   <w:num w:numId="14" w16cid:durableId="1607349664">
     <w:abstractNumId w:val="1"/>
   </w:num>
   <w:num w:numId="15" w16cid:durableId="1543857507">
-    <w:abstractNumId w:val="28"/>
+    <w:abstractNumId w:val="34"/>
   </w:num>
   <w:num w:numId="16" w16cid:durableId="1514144657">
-    <w:abstractNumId w:val="49"/>
+    <w:abstractNumId w:val="61"/>
   </w:num>
   <w:num w:numId="17" w16cid:durableId="1510562697">
-    <w:abstractNumId w:val="45"/>
+    <w:abstractNumId w:val="56"/>
   </w:num>
   <w:num w:numId="18" w16cid:durableId="97410276">
-    <w:abstractNumId w:val="27"/>
+    <w:abstractNumId w:val="33"/>
   </w:num>
   <w:num w:numId="19" w16cid:durableId="1446071585">
-    <w:abstractNumId w:val="11"/>
+    <w:abstractNumId w:val="12"/>
   </w:num>
   <w:num w:numId="20" w16cid:durableId="1546482672">
     <w:abstractNumId w:val="3"/>
@@ -13816,100 +16577,136 @@
     <w:abstractNumId w:val="0"/>
   </w:num>
   <w:num w:numId="22" w16cid:durableId="22445106">
-    <w:abstractNumId w:val="39"/>
+    <w:abstractNumId w:val="50"/>
   </w:num>
   <w:num w:numId="23" w16cid:durableId="225652077">
-    <w:abstractNumId w:val="30"/>
+    <w:abstractNumId w:val="37"/>
   </w:num>
   <w:num w:numId="24" w16cid:durableId="212934121">
-    <w:abstractNumId w:val="9"/>
+    <w:abstractNumId w:val="10"/>
   </w:num>
   <w:num w:numId="25" w16cid:durableId="1164391229">
-    <w:abstractNumId w:val="33"/>
+    <w:abstractNumId w:val="41"/>
   </w:num>
   <w:num w:numId="26" w16cid:durableId="1315643759">
-    <w:abstractNumId w:val="36"/>
+    <w:abstractNumId w:val="46"/>
   </w:num>
   <w:num w:numId="27" w16cid:durableId="424617655">
-    <w:abstractNumId w:val="50"/>
+    <w:abstractNumId w:val="62"/>
   </w:num>
   <w:num w:numId="28" w16cid:durableId="2126659545">
-    <w:abstractNumId w:val="20"/>
+    <w:abstractNumId w:val="23"/>
   </w:num>
   <w:num w:numId="29" w16cid:durableId="934240989">
-    <w:abstractNumId w:val="48"/>
+    <w:abstractNumId w:val="59"/>
   </w:num>
   <w:num w:numId="30" w16cid:durableId="70348787">
     <w:abstractNumId w:val="4"/>
   </w:num>
   <w:num w:numId="31" w16cid:durableId="198015277">
-    <w:abstractNumId w:val="35"/>
+    <w:abstractNumId w:val="44"/>
   </w:num>
   <w:num w:numId="32" w16cid:durableId="933512835">
+    <w:abstractNumId w:val="25"/>
+  </w:num>
+  <w:num w:numId="33" w16cid:durableId="1508593524">
+    <w:abstractNumId w:val="53"/>
+  </w:num>
+  <w:num w:numId="34" w16cid:durableId="1929848820">
+    <w:abstractNumId w:val="57"/>
+  </w:num>
+  <w:num w:numId="35" w16cid:durableId="1162552196">
+    <w:abstractNumId w:val="42"/>
+  </w:num>
+  <w:num w:numId="36" w16cid:durableId="1486388394">
+    <w:abstractNumId w:val="38"/>
+  </w:num>
+  <w:num w:numId="37" w16cid:durableId="1045134239">
+    <w:abstractNumId w:val="47"/>
+  </w:num>
+  <w:num w:numId="38" w16cid:durableId="531112875">
+    <w:abstractNumId w:val="17"/>
+  </w:num>
+  <w:num w:numId="39" w16cid:durableId="2047633205">
     <w:abstractNumId w:val="21"/>
   </w:num>
-  <w:num w:numId="33" w16cid:durableId="1508593524">
-    <w:abstractNumId w:val="42"/>
-  </w:num>
-  <w:num w:numId="34" w16cid:durableId="1929848820">
-    <w:abstractNumId w:val="46"/>
-  </w:num>
-  <w:num w:numId="35" w16cid:durableId="1162552196">
-    <w:abstractNumId w:val="34"/>
-  </w:num>
-  <w:num w:numId="36" w16cid:durableId="1486388394">
-    <w:abstractNumId w:val="31"/>
-  </w:num>
-  <w:num w:numId="37" w16cid:durableId="1045134239">
-    <w:abstractNumId w:val="37"/>
-  </w:num>
-  <w:num w:numId="38" w16cid:durableId="531112875">
-    <w:abstractNumId w:val="15"/>
-  </w:num>
-  <w:num w:numId="39" w16cid:durableId="2047633205">
-    <w:abstractNumId w:val="18"/>
-  </w:num>
   <w:num w:numId="40" w16cid:durableId="1487281442">
-    <w:abstractNumId w:val="26"/>
+    <w:abstractNumId w:val="32"/>
   </w:num>
   <w:num w:numId="41" w16cid:durableId="988443595">
     <w:abstractNumId w:val="5"/>
   </w:num>
   <w:num w:numId="42" w16cid:durableId="1759206026">
-    <w:abstractNumId w:val="10"/>
+    <w:abstractNumId w:val="11"/>
   </w:num>
   <w:num w:numId="43" w16cid:durableId="571543557">
-    <w:abstractNumId w:val="17"/>
+    <w:abstractNumId w:val="20"/>
   </w:num>
   <w:num w:numId="44" w16cid:durableId="1741715197">
     <w:abstractNumId w:val="2"/>
   </w:num>
   <w:num w:numId="45" w16cid:durableId="1051076515">
-    <w:abstractNumId w:val="43"/>
+    <w:abstractNumId w:val="54"/>
   </w:num>
   <w:num w:numId="46" w16cid:durableId="2047022143">
-    <w:abstractNumId w:val="47"/>
+    <w:abstractNumId w:val="58"/>
   </w:num>
   <w:num w:numId="47" w16cid:durableId="1292050816">
     <w:abstractNumId w:val="7"/>
   </w:num>
   <w:num w:numId="48" w16cid:durableId="599878810">
-    <w:abstractNumId w:val="52"/>
+    <w:abstractNumId w:val="64"/>
   </w:num>
   <w:num w:numId="49" w16cid:durableId="1763452301">
-    <w:abstractNumId w:val="23"/>
+    <w:abstractNumId w:val="27"/>
   </w:num>
   <w:num w:numId="50" w16cid:durableId="321586918">
-    <w:abstractNumId w:val="40"/>
+    <w:abstractNumId w:val="51"/>
   </w:num>
   <w:num w:numId="51" w16cid:durableId="1730180606">
-    <w:abstractNumId w:val="38"/>
+    <w:abstractNumId w:val="48"/>
   </w:num>
   <w:num w:numId="52" w16cid:durableId="2013027177">
-    <w:abstractNumId w:val="51"/>
+    <w:abstractNumId w:val="63"/>
   </w:num>
   <w:num w:numId="53" w16cid:durableId="2071030821">
     <w:abstractNumId w:val="6"/>
+  </w:num>
+  <w:num w:numId="54" w16cid:durableId="178353878">
+    <w:abstractNumId w:val="24"/>
+  </w:num>
+  <w:num w:numId="55" w16cid:durableId="972751459">
+    <w:abstractNumId w:val="30"/>
+  </w:num>
+  <w:num w:numId="56" w16cid:durableId="1305043036">
+    <w:abstractNumId w:val="60"/>
+  </w:num>
+  <w:num w:numId="57" w16cid:durableId="1994992618">
+    <w:abstractNumId w:val="43"/>
+  </w:num>
+  <w:num w:numId="58" w16cid:durableId="872695375">
+    <w:abstractNumId w:val="8"/>
+  </w:num>
+  <w:num w:numId="59" w16cid:durableId="459038835">
+    <w:abstractNumId w:val="36"/>
+  </w:num>
+  <w:num w:numId="60" w16cid:durableId="671371626">
+    <w:abstractNumId w:val="19"/>
+  </w:num>
+  <w:num w:numId="61" w16cid:durableId="325090304">
+    <w:abstractNumId w:val="49"/>
+  </w:num>
+  <w:num w:numId="62" w16cid:durableId="1117093395">
+    <w:abstractNumId w:val="45"/>
+  </w:num>
+  <w:num w:numId="63" w16cid:durableId="1601330722">
+    <w:abstractNumId w:val="29"/>
+  </w:num>
+  <w:num w:numId="64" w16cid:durableId="1008026613">
+    <w:abstractNumId w:val="39"/>
+  </w:num>
+  <w:num w:numId="65" w16cid:durableId="1862432569">
+    <w:abstractNumId w:val="15"/>
   </w:num>
 </w:numbering>
 </file>

</xml_diff>